<commit_message>
Refresh Journal of Navigation submission release
</commit_message>
<xml_diff>
--- a/paper/jon_manuscript.docx
+++ b/paper/jon_manuscript.docx
@@ -2,7 +2,7 @@
 <file path=word/document.xml><?xml version="1.0" encoding="utf-8"?>
 <w:document xmlns:w="http://schemas.openxmlformats.org/wordprocessingml/2006/main" xmlns:m="http://schemas.openxmlformats.org/officeDocument/2006/math" xmlns:r="http://schemas.openxmlformats.org/officeDocument/2006/relationships" xmlns:o="urn:schemas-microsoft-com:office:office" xmlns:v="urn:schemas-microsoft-com:vml" xmlns:w10="urn:schemas-microsoft-com:office:word" xmlns:a="http://schemas.openxmlformats.org/drawingml/2006/main" xmlns:pic="http://schemas.openxmlformats.org/drawingml/2006/picture" xmlns:wp="http://schemas.openxmlformats.org/drawingml/2006/wordprocessingDrawing">
   <w:body>
-    <w:bookmarkStart w:id="45" w:name="X1ced17b413bb5aed73f5574fc5e1440d6537c2e"/>
+    <w:bookmarkStart w:id="46" w:name="X1ced17b413bb5aed73f5574fc5e1440d6537c2e"/>
     <w:p>
       <w:pPr>
         <w:pStyle w:val="Heading1"/>
@@ -24,31 +24,31 @@
         <w:pStyle w:val="BodyText"/>
       </w:pPr>
       <w:r>
-        <w:t xml:space="preserve">Authors: [Author 1], [Author 2], [Author 3]</w:t>
-      </w:r>
-    </w:p>
-    <w:p>
-      <w:pPr>
-        <w:pStyle w:val="BodyText"/>
-      </w:pPr>
-      <w:r>
-        <w:t xml:space="preserve">Affiliations: [Affiliation details to be completed before ScholarOne upload]</w:t>
-      </w:r>
-    </w:p>
-    <w:p>
-      <w:pPr>
-        <w:pStyle w:val="BodyText"/>
-      </w:pPr>
-      <w:r>
-        <w:t xml:space="preserve">Corresponding author: [Name, email, ORCID]</w:t>
-      </w:r>
-    </w:p>
-    <w:p>
-      <w:pPr>
-        <w:pStyle w:val="BodyText"/>
-      </w:pPr>
-      <w:r>
-        <w:t xml:space="preserve">Generated from repository artifacts: 2026-05-17T02:48:32.132551+00:00</w:t>
+        <w:t xml:space="preserve">Short title: AIS Benchmark for Risk Warning</w:t>
+      </w:r>
+    </w:p>
+    <w:p>
+      <w:pPr>
+        <w:pStyle w:val="BodyText"/>
+      </w:pPr>
+      <w:r>
+        <w:t xml:space="preserve">Author: Li Bo</w:t>
+      </w:r>
+    </w:p>
+    <w:p>
+      <w:pPr>
+        <w:pStyle w:val="BodyText"/>
+      </w:pPr>
+      <w:r>
+        <w:t xml:space="preserve">Affiliation: China Maritime Service Center, China</w:t>
+      </w:r>
+    </w:p>
+    <w:p>
+      <w:pPr>
+        <w:pStyle w:val="BodyText"/>
+      </w:pPr>
+      <w:r>
+        <w:t xml:space="preserve">Corresponding author: Li Bo, li.bo@cmaritime.com.cn</w:t>
       </w:r>
     </w:p>
     <w:bookmarkStart w:id="9" w:name="abstract"/>
@@ -57,7 +57,7 @@
         <w:pStyle w:val="Heading2"/>
       </w:pPr>
       <w:r>
-        <w:t xml:space="preserve">Abstract</w:t>
+        <w:t xml:space="preserve">ABSTRACT</w:t>
       </w:r>
     </w:p>
     <w:p>
@@ -65,7 +65,7 @@
         <w:pStyle w:val="FirstParagraph"/>
       </w:pPr>
       <w:r>
-        <w:t xml:space="preserve">Short-horizon ship trajectory prediction is increasingly presented as a machine-learning problem, yet navigation practice also requires transparent baselines, generalisation evidence and a defensible link between forecast error and operational warnings. This paper presents a reproducible benchmark for AIS trajectory prediction and CPA/TCPA risk-warning support. The evidence pack is built from NOAA historical AIS data covering four source dates (2024-01-02, 2024-01-09, 2024-02-06, 2024-03-05) and contains 186,326 trajectory windows from 7,425 MMSI values. Each sample uses 30 one-minute history points to forecast 15 one-minute future positions. The protocol records raw checksums, processed checksums, vessel identifiers, source dates, regions, speeds, turn-intensity metadata, temporal holdout labels and vessel-disjoint holdout labels. We compare kinematic, Kalman-style, linear and neural baselines using Haversine ADE/FDE and local-component RMSE/MAE, then evaluate how selected forecasts affect AIS-derived CPA/TCPA warning precision, recall, false alarms and missed warnings. The best ADE model in the current non-debug run is a Kalman-style constant-velocity baseline: 1,759.7 m ADE on the temporal holdout and 3,109.4 m ADE on the vessel-disjoint holdout. Constant velocity remains a strong reference on the temporal holdout (2,751.3 m ADE) but degrades more under vessel-disjoint testing (9,553.5 m ADE). Naive neural baselines do not outperform the strong motion baselines under this controlled protocol. In the risk-warning evaluation, the Kalman-style baseline reaches precision 0.963, recall 0.900, false-alarm rate 0.012 and missed-warning rate 0.100 across 2,000 AIS-derived encounter scenarios. The contribution is not an autonomous collision-avoidance system; it is an auditable navigation benchmark that shows why simple baselines and downstream warning metrics should accompany claims about AIS prediction performance.</w:t>
+        <w:t xml:space="preserve">Short-horizon AIS trajectory prediction is often framed as a machine-learning problem, but navigation use also requires strong baselines, reproducible splits and downstream warning evidence. This study reports an auditable benchmark built from NOAA historical AIS data on four 2024 dates, containing 186,326 trajectory windows from 7,425 MMSI values. Each sample uses 30 one-minute history points to forecast 15 one-minute positions. Kinematic, Kalman-style, linear and neural baselines are evaluated with Haversine ADE/FDE and local-component RMSE/MAE, followed by CPA/TCPA risk-warning metrics. Kalman-CV gives the best mean ADE in the reported benchmark run: 1,759.7 m on the temporal holdout and 3,109.4 m on the vessel-disjoint holdout. Under the documented baseline configurations, the neural sequence baselines do not outperform the strongest motion baselines. In 2,000 AIS-derived encounter scenarios, Kalman-CV reaches precision 0.963 and recall 0.900. The contribution is a reproducible navigation benchmark, not autonomous collision-avoidance validation.</w:t>
       </w:r>
     </w:p>
     <w:bookmarkEnd w:id="9"/>
@@ -75,7 +75,7 @@
         <w:pStyle w:val="Heading2"/>
       </w:pPr>
       <w:r>
-        <w:t xml:space="preserve">1. Introduction</w:t>
+        <w:t xml:space="preserve">1. INTRODUCTION</w:t>
       </w:r>
     </w:p>
     <w:p>
@@ -99,7 +99,7 @@
         <w:pStyle w:val="BodyText"/>
       </w:pPr>
       <w:r>
-        <w:t xml:space="preserve">The paper is written for a navigation audience. It treats AIS prediction as a support layer for maritime situational awareness, not as a stand-alone deep-learning leaderboard. This framing leads to three research questions. RQ1 asks how simple kinematic, statistical and neural baselines compare under an audited short-horizon AIS protocol. RQ2 asks whether model rankings remain stable under temporal and vessel-disjoint holdouts. RQ3 asks how trajectory-prediction differences affect CPA/TCPA warning precision, recall, false alarms and missed warnings. These questions are deliberately conservative because they map to the evidence that can be defended from the current repository artifacts.</w:t>
+        <w:t xml:space="preserve">For navigation readers, AIS prediction is best understood as a support layer for maritime situational awareness, not as a stand-alone deep-learning leaderboard. This framing leads to three research questions. RQ1 asks how simple kinematic, statistical and neural baselines compare under an audited short-horizon AIS protocol. RQ2 asks whether model rankings remain stable under temporal and vessel-disjoint holdouts. RQ3 asks how trajectory-prediction differences affect CPA/TCPA warning precision, recall, false alarms and missed warnings. These questions are deliberately conservative because they map to the evidence available in the audited data and result files.</w:t>
       </w:r>
     </w:p>
     <w:p>
@@ -115,31 +115,31 @@
         <w:pStyle w:val="BodyText"/>
       </w:pPr>
       <w:r>
-        <w:t xml:space="preserve">The first contribution is a reproducible, metadata-rich AIS benchmark pipeline. The pipeline records raw file checksums, processed-file checksum, row counts, MMSI counts, timestamp range, region labels, average speed, turn-intensity bins, interpolation ratio, and split labels. The processed artifact keeps both temporal and vessel-disjoint labels, so the same data build supports two complementary forms of generalisation testing. This is important because temporal holdouts test later windows from the same broad traffic distribution, while vessel-disjoint holdouts ask whether the model transfers to MMSI values not used for training.</w:t>
-      </w:r>
-    </w:p>
-    <w:p>
-      <w:pPr>
-        <w:pStyle w:val="BodyText"/>
-      </w:pPr>
-      <w:r>
-        <w:t xml:space="preserve">The second contribution is a baseline-centred experimental result. In the current run, the Kalman-style constant-velocity baseline is the best mean-ADE model in both holdouts, and the ordinary constant-velocity baseline remains a strong reference. Ridge regression is close to Kalman-CV on the vessel-disjoint holdout (3,446.9 m ADE), but neural sequence baselines remain far behind the kinematic and linear baselines. This result should not be read as a universal claim that neural models are unsuitable for maritime prediction. It is a cautionary, reproducible result: architecture-superiority claims require stronger tuning, preprocessing, split discipline and external validation than a single reported run.</w:t>
-      </w:r>
-    </w:p>
-    <w:p>
-      <w:pPr>
-        <w:pStyle w:val="BodyText"/>
-      </w:pPr>
-      <w:r>
-        <w:t xml:space="preserve">The third contribution is a downstream risk-warning evaluation that translates selected trajectories into CPA/TCPA warning classifications. The current risk artifact contains 2,000 AIS-derived encounter scenarios from 5,000 evaluated samples, with a warning threshold of 0.5 nautical miles and a search radius of 3.0 nautical miles. The labels are derived from observed future separation inside the forecast horizon, so the analysis remains a historical decision-support evaluation rather than a closed-loop collision-avoidance simulation.</w:t>
-      </w:r>
-    </w:p>
-    <w:p>
-      <w:pPr>
-        <w:pStyle w:val="BodyText"/>
-      </w:pPr>
-      <w:r>
-        <w:t xml:space="preserve">This conservative framing is also intended to make the work useful even if a reader disagrees with the specific baseline set. The evidence chain is reusable: new models can be added, alternative warning thresholds can be tested, and later AIS source dates can be processed without rewriting the manuscript logic. The project therefore contributes a research workflow as well as a numerical result. The result reported here is the current state of that workflow, not a claim that the model list is final.</w:t>
+        <w:t xml:space="preserve">The first contribution is a reproducible AIS benchmark protocol. It records raw-file checksums, a processed manifest, temporal split labels and vessel-disjoint split labels for a short-horizon forecasting task. The processed artefact keeps both temporal and vessel-disjoint labels, so the same data build supports two complementary forms of generalisation testing. This is important because temporal holdouts test later windows from the same broad traffic distribution, while vessel-disjoint holdouts ask whether the model transfers to MMSI values not used for training.</w:t>
+      </w:r>
+    </w:p>
+    <w:p>
+      <w:pPr>
+        <w:pStyle w:val="BodyText"/>
+      </w:pPr>
+      <w:r>
+        <w:t xml:space="preserve">The second contribution is a baseline-centred empirical finding. In the reported benchmark run, the Kalman-style constant-velocity baseline is the best mean-ADE model in both holdouts, and the ordinary constant-velocity baseline remains a strong reference. Ridge regression is close to Kalman-CV on the vessel-disjoint holdout (3,446.9 m ADE), while the documented neural sequence baselines remain behind the kinematic and linear baselines. This result should not be read as a universal claim that neural models are unsuitable for maritime prediction. It is a cautionary, reproducible result: architecture-superiority claims require stronger tuning, preprocessing, split discipline and external validation than a single reported run.</w:t>
+      </w:r>
+    </w:p>
+    <w:p>
+      <w:pPr>
+        <w:pStyle w:val="BodyText"/>
+      </w:pPr>
+      <w:r>
+        <w:t xml:space="preserve">The third contribution is a navigation-facing warning evaluation. It translates selected trajectory pairs into CPA/TCPA warning classifications and reports precision, recall, false alarms, missed warnings, lead-time error and CPA error. The labels are derived from observed future separation inside the forecast horizon, so the analysis remains a historical decision-support evaluation rather than a closed-loop collision-avoidance simulation.</w:t>
+      </w:r>
+    </w:p>
+    <w:p>
+      <w:pPr>
+        <w:pStyle w:val="BodyText"/>
+      </w:pPr>
+      <w:r>
+        <w:t xml:space="preserve">This conservative framing is also intended to make the work useful even if a reader disagrees with the specific baseline set. The evidence chain is reusable: new models can be added, alternative warning thresholds can be tested, and later AIS source dates can be processed without rewriting the manuscript logic. The workflow therefore contributes a reproducible evaluation pattern as well as a numerical result. The result reported here is one state of that workflow, not a claim that the model list is final.</w:t>
       </w:r>
     </w:p>
     <w:p>
@@ -157,7 +157,7 @@
         <w:pStyle w:val="Heading2"/>
       </w:pPr>
       <w:r>
-        <w:t xml:space="preserve">2. Related Work</w:t>
+        <w:t xml:space="preserve">2. RELATED WORK</w:t>
       </w:r>
     </w:p>
     <w:p>
@@ -189,15 +189,15 @@
         <w:pStyle w:val="BodyText"/>
       </w:pPr>
       <w:r>
-        <w:t xml:space="preserve">This baseline stance follows a broader principle in safety-related prediction. A complex model should earn its complexity by providing a measurable advantage under a relevant operational criterion. That advantage might be lower FDE, better stability during manoeuvres, fewer missed warnings, calibrated uncertainty or robustness to vessel-disjoint testing. If the advantage is absent, the simpler model may still be preferable because it is faster, easier to audit and easier to explain. In this study, the strongest current result comes from such a simple model family.</w:t>
-      </w:r>
-    </w:p>
-    <w:p>
-      <w:pPr>
-        <w:pStyle w:val="BodyText"/>
-      </w:pPr>
-      <w:r>
-        <w:t xml:space="preserve">Neural sequence models provide flexible function approximation and can learn nonlinear temporal patterns, but they are sensitive to representation, normalisation, training regime and data split. LSTM networks (Hochreiter and Schmidhuber, 1997), GRU networks (Cho et al., 2014), temporal convolutional networks (Bai et al., 2018) and Transformers (Vaswani et al., 2017) are all reasonable baseline families for sequence forecasting. Their inclusion in this benchmark does not imply that the particular shallow configurations used here exhaust the potential of neural AIS prediction. Instead, they serve as controlled baselines that expose a practical issue: neural models can underperform badly if the protocol, scaling and training budget are not aligned with the data and task.</w:t>
+        <w:t xml:space="preserve">This baseline stance follows a broader principle in safety-related prediction. A complex model should earn its complexity by providing a measurable advantage under a relevant operational criterion. That advantage might be lower FDE, better stability during manoeuvres, fewer missed warnings, calibrated uncertainty or robustness to vessel-disjoint testing. If the advantage is absent, the simpler model may still be preferable because it is faster, easier to audit and easier to explain. In this study, the strongest reported result comes from such a simple model family.</w:t>
+      </w:r>
+    </w:p>
+    <w:p>
+      <w:pPr>
+        <w:pStyle w:val="BodyText"/>
+      </w:pPr>
+      <w:r>
+        <w:t xml:space="preserve">Neural sequence models provide flexible function approximation and can learn nonlinear temporal patterns, but they are sensitive to representation, normalisation, training regime and data split. LSTM networks (Hochreiter and Schmidhuber, 1997), GRU networks (Cho et al., 2014), temporal convolutional networks (Bai et al., 2018) and Transformers (Vaswani et al., 2017) are all reasonable baseline families for sequence forecasting. Their inclusion in this benchmark does not imply that the particular shallow configurations used here exhaust the potential of neural AIS prediction. Instead, they serve as documented baselines that expose a practical issue: neural models require careful protocol, scaling and training-budget choices before they can support navigation-facing superiority claims.</w:t>
       </w:r>
     </w:p>
     <w:p>
@@ -221,7 +221,7 @@
         <w:pStyle w:val="BodyText"/>
       </w:pPr>
       <w:r>
-        <w:t xml:space="preserve">Reproducibility is central because AIS studies can be surprisingly difficult to compare. Small changes in cleaning rules, interpolation, sample slicing, vessel filtering, split construction or distance metrics can alter results. Scientific-computing recommendations such as Wilson et al. (2017) and reproducibility discussions such as Leek and Peng (2015) and Pineau et al. (2021) motivate the artifact-first design used here. Statistical-comparison guidance from Demsar (2006) also supports paired evaluation and transparent reporting rather than a single aggregate number. The benchmark therefore stores generated evidence as CSV and JSON artifacts and regenerates manuscript tables from those artifacts.</w:t>
+        <w:t xml:space="preserve">Reproducibility is central because AIS studies can be surprisingly difficult to compare. Small changes in cleaning rules, interpolation, sample slicing, vessel filtering, split construction or distance metrics can alter results. Scientific-computing recommendations such as Wilson et al. (2017) and reproducibility discussions such as Leek and Peng (2015) and Pineau et al. (2021) motivate the artefact-first design used here. Statistical-comparison guidance from Demsar (2006) also supports paired evaluation and transparent reporting rather than a single aggregate number. The benchmark therefore stores generated evidence as CSV and JSON artefacts and regenerates manuscript tables from those artefacts.</w:t>
       </w:r>
     </w:p>
     <w:p>
@@ -233,13 +233,13 @@
       </w:r>
     </w:p>
     <w:bookmarkEnd w:id="11"/>
-    <w:bookmarkStart w:id="15" w:name="data-and-reproducible-protocol"/>
+    <w:bookmarkStart w:id="16" w:name="data-and-reproducible-protocol"/>
     <w:p>
       <w:pPr>
         <w:pStyle w:val="Heading2"/>
       </w:pPr>
       <w:r>
-        <w:t xml:space="preserve">3. Data and Reproducible Protocol</w:t>
+        <w:t xml:space="preserve">3. DATA AND REPRODUCIBLE PROTOCOL</w:t>
       </w:r>
     </w:p>
     <w:p>
@@ -247,7 +247,7 @@
         <w:pStyle w:val="FirstParagraph"/>
       </w:pPr>
       <w:r>
-        <w:t xml:space="preserve">The data source is the NOAA MarineCadastre.gov AIS archive (MarineCadastre.gov, 2024; NOAA Office for Coastal Management, 2026). The current processed artifact covers four source dates: 2024-01-02, 2024-01-09, 2024-02-06, 2024-03-05. The data manifest records 186,326 trajectory windows, 7,425 unique MMSI values, and a time range from 2024-01-02T00:00:00 to 2024-03-05T12:59:00. The region labels represented in the current build are east_gulf_coast, hawaii_pacific, other, west_coast. The mean speed over ground recorded in the processed sample metadata is 2.22 knots, with a maximum of 34.88 knots. The mean turn-intensity metadata value is 17.69 degrees, and the mean interpolation ratio is 0.181.</w:t>
+        <w:t xml:space="preserve">The data source is the NOAA MarineCadastre.gov AIS archive (MarineCadastre.gov, 2024; NOAA Office for Coastal Management, 2026). The processed artefact covers four source dates: 2024-01-02, 2024-01-09, 2024-02-06, 2024-03-05. The data manifest records 186,326 trajectory windows, 7,425 unique MMSI values, and a time range from 2024-01-02T00:00:00 to 2024-03-05T12:59:00. The region labels represented in the processed build are east_gulf_coast, hawaii_pacific, other, west_coast. The mean speed over ground recorded in the processed sample metadata is 2.22 knots, with a maximum of 34.88 knots. The mean turn-intensity metadata value is 17.69 degrees, and the mean interpolation ratio is 0.181.</w:t>
       </w:r>
     </w:p>
     <w:p>
@@ -282,6 +282,407 @@
         <w:t xml:space="preserve">The vessel-disjoint split is particularly important because AIS windows from the same vessel are not independent in a behavioural sense. If a model sees many windows from a vessel during training, it may partly learn that vessel’s typical operating area or motion regime. Holding out MMSI values reduces this leakage and creates a more demanding test. It is still not perfect, because vessels can share routes and regions, but it moves the benchmark closer to the way a deployed system would encounter previously unseen targets.</w:t>
       </w:r>
     </w:p>
+    <w:bookmarkStart w:id="15" w:name="data-quality-and-representativeness"/>
+    <w:p>
+      <w:pPr>
+        <w:pStyle w:val="Heading3"/>
+      </w:pPr>
+      <w:r>
+        <w:t xml:space="preserve">Data quality and representativeness</w:t>
+      </w:r>
+    </w:p>
+    <w:p>
+      <w:pPr>
+        <w:pStyle w:val="FirstParagraph"/>
+      </w:pPr>
+      <w:r>
+        <w:t xml:space="preserve">The dataset is suitable for a reproducible benchmark, but it should not be read as a balanced survey of all maritime operating conditions. Table 1 summarises the main representativeness checks available from the processed metadata and the risk-warning scenario file. The low mean speed and the temporal-test speed-bin composition indicate that many windows are slow-moving, near-shore or port-influenced. This does not invalidate a short-horizon benchmark, but it does mean that aggregate ADE must be interpreted together with speed, region and horizon summaries.</w:t>
+      </w:r>
+    </w:p>
+    <w:p>
+      <w:pPr>
+        <w:pStyle w:val="BodyText"/>
+      </w:pPr>
+      <w:r>
+        <w:t xml:space="preserve">Table 1. Data representativeness and quality summary.</w:t>
+      </w:r>
+    </w:p>
+    <w:tbl>
+      <w:tblPr>
+        <w:tblStyle w:val="Table"/>
+        <w:tblW w:type="pct" w:w="5000"/>
+        <w:tblLayout w:type="fixed"/>
+        <w:tblLook w:firstRow="1" w:lastRow="0" w:firstColumn="0" w:lastColumn="0" w:noHBand="0" w:noVBand="0" w:val="0020"/>
+      </w:tblPr>
+      <w:tblGrid>
+        <w:gridCol w:w="2376"/>
+        <w:gridCol w:w="3168"/>
+        <w:gridCol w:w="2376"/>
+      </w:tblGrid>
+      <w:tr>
+        <w:trPr>
+          <w:tblHeader w:val="on"/>
+        </w:trPr>
+        <w:tc>
+          <w:tcPr/>
+          <w:p>
+            <w:pPr>
+              <w:pStyle w:val="Compact"/>
+            </w:pPr>
+            <w:r>
+              <w:t xml:space="preserve">Item</w:t>
+            </w:r>
+          </w:p>
+        </w:tc>
+        <w:tc>
+          <w:tcPr/>
+          <w:p>
+            <w:pPr>
+              <w:pStyle w:val="Compact"/>
+              <w:jc w:val="right"/>
+            </w:pPr>
+            <w:r>
+              <w:t xml:space="preserve">Value</w:t>
+            </w:r>
+          </w:p>
+        </w:tc>
+        <w:tc>
+          <w:tcPr/>
+          <w:p>
+            <w:pPr>
+              <w:pStyle w:val="Compact"/>
+            </w:pPr>
+            <w:r>
+              <w:t xml:space="preserve">Interpretation</w:t>
+            </w:r>
+          </w:p>
+        </w:tc>
+      </w:tr>
+      <w:tr>
+        <w:tc>
+          <w:tcPr/>
+          <w:p>
+            <w:pPr>
+              <w:pStyle w:val="Compact"/>
+            </w:pPr>
+            <w:r>
+              <w:t xml:space="preserve">Source dates</w:t>
+            </w:r>
+          </w:p>
+        </w:tc>
+        <w:tc>
+          <w:tcPr/>
+          <w:p>
+            <w:pPr>
+              <w:pStyle w:val="Compact"/>
+              <w:jc w:val="right"/>
+            </w:pPr>
+            <w:r>
+              <w:t xml:space="preserve">4</w:t>
+            </w:r>
+          </w:p>
+        </w:tc>
+        <w:tc>
+          <w:tcPr/>
+          <w:p>
+            <w:pPr>
+              <w:pStyle w:val="Compact"/>
+            </w:pPr>
+            <w:r>
+              <w:t xml:space="preserve">Multi-date historical AIS sample; not a seasonal or global coverage claim.</w:t>
+            </w:r>
+          </w:p>
+        </w:tc>
+      </w:tr>
+      <w:tr>
+        <w:tc>
+          <w:tcPr/>
+          <w:p>
+            <w:pPr>
+              <w:pStyle w:val="Compact"/>
+            </w:pPr>
+            <w:r>
+              <w:t xml:space="preserve">Trajectory windows</w:t>
+            </w:r>
+          </w:p>
+        </w:tc>
+        <w:tc>
+          <w:tcPr/>
+          <w:p>
+            <w:pPr>
+              <w:pStyle w:val="Compact"/>
+              <w:jc w:val="right"/>
+            </w:pPr>
+            <w:r>
+              <w:t xml:space="preserve">186,326</w:t>
+            </w:r>
+          </w:p>
+        </w:tc>
+        <w:tc>
+          <w:tcPr/>
+          <w:p>
+            <w:pPr>
+              <w:pStyle w:val="Compact"/>
+            </w:pPr>
+            <w:r>
+              <w:t xml:space="preserve">Adequate scale for a benchmark-style evaluation.</w:t>
+            </w:r>
+          </w:p>
+        </w:tc>
+      </w:tr>
+      <w:tr>
+        <w:tc>
+          <w:tcPr/>
+          <w:p>
+            <w:pPr>
+              <w:pStyle w:val="Compact"/>
+            </w:pPr>
+            <w:r>
+              <w:t xml:space="preserve">Unique MMSI values</w:t>
+            </w:r>
+          </w:p>
+        </w:tc>
+        <w:tc>
+          <w:tcPr/>
+          <w:p>
+            <w:pPr>
+              <w:pStyle w:val="Compact"/>
+              <w:jc w:val="right"/>
+            </w:pPr>
+            <w:r>
+              <w:t xml:space="preserve">7,425</w:t>
+            </w:r>
+          </w:p>
+        </w:tc>
+        <w:tc>
+          <w:tcPr/>
+          <w:p>
+            <w:pPr>
+              <w:pStyle w:val="Compact"/>
+            </w:pPr>
+            <w:r>
+              <w:t xml:space="preserve">Broad vessel-identity coverage for vessel-disjoint testing.</w:t>
+            </w:r>
+          </w:p>
+        </w:tc>
+      </w:tr>
+      <w:tr>
+        <w:tc>
+          <w:tcPr/>
+          <w:p>
+            <w:pPr>
+              <w:pStyle w:val="Compact"/>
+            </w:pPr>
+            <w:r>
+              <w:t xml:space="preserve">Mean SOG</w:t>
+            </w:r>
+          </w:p>
+        </w:tc>
+        <w:tc>
+          <w:tcPr/>
+          <w:p>
+            <w:pPr>
+              <w:pStyle w:val="Compact"/>
+              <w:jc w:val="right"/>
+            </w:pPr>
+            <w:r>
+              <w:t xml:space="preserve">2.22 kn; max 34.88 kn</w:t>
+            </w:r>
+          </w:p>
+        </w:tc>
+        <w:tc>
+          <w:tcPr/>
+          <w:p>
+            <w:pPr>
+              <w:pStyle w:val="Compact"/>
+            </w:pPr>
+            <w:r>
+              <w:t xml:space="preserve">Low-speed traffic is prominent, so aggregate metrics are interpreted with slice results.</w:t>
+            </w:r>
+          </w:p>
+        </w:tc>
+      </w:tr>
+      <w:tr>
+        <w:tc>
+          <w:tcPr/>
+          <w:p>
+            <w:pPr>
+              <w:pStyle w:val="Compact"/>
+            </w:pPr>
+            <w:r>
+              <w:t xml:space="preserve">Temporal-test speed bins</w:t>
+            </w:r>
+          </w:p>
+        </w:tc>
+        <w:tc>
+          <w:tcPr/>
+          <w:p>
+            <w:pPr>
+              <w:pStyle w:val="Compact"/>
+              <w:jc w:val="right"/>
+            </w:pPr>
+            <w:r>
+              <w:t xml:space="preserve">0-2 kn 20,601 (73.7%); 2-8 kn 4,772 (17.1%); 8-15 kn 2,205 (7.9%); 15-50 kn 372 (1.3%)</w:t>
+            </w:r>
+          </w:p>
+        </w:tc>
+        <w:tc>
+          <w:tcPr/>
+          <w:p>
+            <w:pPr>
+              <w:pStyle w:val="Compact"/>
+            </w:pPr>
+            <w:r>
+              <w:t xml:space="preserve">The temporal test set is low-speed dominated.</w:t>
+            </w:r>
+          </w:p>
+        </w:tc>
+      </w:tr>
+      <w:tr>
+        <w:tc>
+          <w:tcPr/>
+          <w:p>
+            <w:pPr>
+              <w:pStyle w:val="Compact"/>
+            </w:pPr>
+            <w:r>
+              <w:t xml:space="preserve">Temporal-test regions</w:t>
+            </w:r>
+          </w:p>
+        </w:tc>
+        <w:tc>
+          <w:tcPr/>
+          <w:p>
+            <w:pPr>
+              <w:pStyle w:val="Compact"/>
+              <w:jc w:val="right"/>
+            </w:pPr>
+            <w:r>
+              <w:t xml:space="preserve">east_gulf_coast 22,583 (80.8%); hawaii_pacific 213 (0.8%); other 550 (2.0%); west_coast 4,604 (16.5%)</w:t>
+            </w:r>
+          </w:p>
+        </w:tc>
+        <w:tc>
+          <w:tcPr/>
+          <w:p>
+            <w:pPr>
+              <w:pStyle w:val="Compact"/>
+            </w:pPr>
+            <w:r>
+              <w:t xml:space="preserve">Region composition is not balanced; regional robustness is not claimed.</w:t>
+            </w:r>
+          </w:p>
+        </w:tc>
+      </w:tr>
+      <w:tr>
+        <w:tc>
+          <w:tcPr/>
+          <w:p>
+            <w:pPr>
+              <w:pStyle w:val="Compact"/>
+            </w:pPr>
+            <w:r>
+              <w:t xml:space="preserve">Interpolation ratio</w:t>
+            </w:r>
+          </w:p>
+        </w:tc>
+        <w:tc>
+          <w:tcPr/>
+          <w:p>
+            <w:pPr>
+              <w:pStyle w:val="Compact"/>
+              <w:jc w:val="right"/>
+            </w:pPr>
+            <w:r>
+              <w:t xml:space="preserve">mean 0.181; max 0.244</w:t>
+            </w:r>
+          </w:p>
+        </w:tc>
+        <w:tc>
+          <w:tcPr/>
+          <w:p>
+            <w:pPr>
+              <w:pStyle w:val="Compact"/>
+            </w:pPr>
+            <w:r>
+              <w:t xml:space="preserve">Interpolation is moderate and remains a possible contributor to tail errors.</w:t>
+            </w:r>
+          </w:p>
+        </w:tc>
+      </w:tr>
+      <w:tr>
+        <w:tc>
+          <w:tcPr/>
+          <w:p>
+            <w:pPr>
+              <w:pStyle w:val="Compact"/>
+            </w:pPr>
+            <w:r>
+              <w:t xml:space="preserve">Turn intensity</w:t>
+            </w:r>
+          </w:p>
+        </w:tc>
+        <w:tc>
+          <w:tcPr/>
+          <w:p>
+            <w:pPr>
+              <w:pStyle w:val="Compact"/>
+              <w:jc w:val="right"/>
+            </w:pPr>
+            <w:r>
+              <w:t xml:space="preserve">mean 17.69 deg; max 148.8 deg</w:t>
+            </w:r>
+          </w:p>
+        </w:tc>
+        <w:tc>
+          <w:tcPr/>
+          <w:p>
+            <w:pPr>
+              <w:pStyle w:val="Compact"/>
+            </w:pPr>
+            <w:r>
+              <w:t xml:space="preserve">Manoeuvring heterogeneity supports horizon and slice analysis.</w:t>
+            </w:r>
+          </w:p>
+        </w:tc>
+      </w:tr>
+      <w:tr>
+        <w:tc>
+          <w:tcPr/>
+          <w:p>
+            <w:pPr>
+              <w:pStyle w:val="Compact"/>
+            </w:pPr>
+            <w:r>
+              <w:t xml:space="preserve">Risk-warning scenarios</w:t>
+            </w:r>
+          </w:p>
+        </w:tc>
+        <w:tc>
+          <w:tcPr/>
+          <w:p>
+            <w:pPr>
+              <w:pStyle w:val="Compact"/>
+              <w:jc w:val="right"/>
+            </w:pPr>
+            <w:r>
+              <w:t xml:space="preserve">2,000 scenarios; 520 truth warnings; median observed CPA 1.302 nmi; median observed TCPA 7.0 min; regions: east_gulf_coast 991, west_coast 953, hawaii_pacific 41, other 15</w:t>
+            </w:r>
+          </w:p>
+        </w:tc>
+        <w:tc>
+          <w:tcPr/>
+          <w:p>
+            <w:pPr>
+              <w:pStyle w:val="Compact"/>
+            </w:pPr>
+            <w:r>
+              <w:t xml:space="preserve">Decision-support slice, not a full encounter-population model.</w:t>
+            </w:r>
+          </w:p>
+        </w:tc>
+      </w:tr>
+    </w:tbl>
     <w:p>
       <w:pPr>
         <w:pStyle w:val="BodyText"/>
@@ -299,7 +700,7 @@
           <wp:inline>
             <wp:extent cx="5334000" cy="1047278"/>
             <wp:effectExtent b="0" l="0" r="0" t="0"/>
-            <wp:docPr descr="Figure 1. Reproducible evidence chain used for the JON submission candidate." title="" id="13" name="Picture"/>
+            <wp:docPr descr="Figure 1. Reproducible evidence chain used in this study." title="" id="13" name="Picture"/>
             <a:graphic>
               <a:graphicData uri="http://schemas.openxmlformats.org/drawingml/2006/picture">
                 <pic:pic>
@@ -342,105 +743,15 @@
         <w:pStyle w:val="ImageCaption"/>
       </w:pPr>
       <w:r>
-        <w:t xml:space="preserve">Figure 1. Reproducible evidence chain used for the JON submission candidate.</w:t>
-      </w:r>
-    </w:p>
-    <w:p>
-      <w:pPr>
-        <w:pStyle w:val="BodyText"/>
-      </w:pPr>
-      <w:r>
-        <w:t xml:space="preserve">The benchmark is designed so that the paper and project mutually support one another. The manuscript does not manually transcribe hidden spreadsheet calculations. The tables and figures are generated from</w:t>
-      </w:r>
-      <w:r>
-        <w:t xml:space="preserve"> </w:t>
-      </w:r>
-      <w:r>
-        <w:rPr>
-          <w:rStyle w:val="VerbatimChar"/>
-        </w:rPr>
-        <w:t xml:space="preserve">outputs/audit/multiday_data_manifest.json</w:t>
-      </w:r>
-      <w:r>
-        <w:t xml:space="preserve">,</w:t>
-      </w:r>
-      <w:r>
-        <w:t xml:space="preserve"> </w:t>
-      </w:r>
-      <w:r>
-        <w:rPr>
-          <w:rStyle w:val="VerbatimChar"/>
-        </w:rPr>
-        <w:t xml:space="preserve">outputs/final_multiday/model_metrics.csv</w:t>
-      </w:r>
-      <w:r>
-        <w:t xml:space="preserve">,</w:t>
-      </w:r>
-      <w:r>
-        <w:t xml:space="preserve"> </w:t>
-      </w:r>
-      <w:r>
-        <w:rPr>
-          <w:rStyle w:val="VerbatimChar"/>
-        </w:rPr>
-        <w:t xml:space="preserve">outputs/final_multiday/error_summary_by_horizon.csv</w:t>
-      </w:r>
-      <w:r>
-        <w:t xml:space="preserve">,</w:t>
-      </w:r>
-      <w:r>
-        <w:t xml:space="preserve"> </w:t>
-      </w:r>
-      <w:r>
-        <w:rPr>
-          <w:rStyle w:val="VerbatimChar"/>
-        </w:rPr>
-        <w:t xml:space="preserve">outputs/final_multiday/error_summary_by_group.csv</w:t>
-      </w:r>
-      <w:r>
-        <w:t xml:space="preserve">,</w:t>
-      </w:r>
-      <w:r>
-        <w:t xml:space="preserve"> </w:t>
-      </w:r>
-      <w:r>
-        <w:rPr>
-          <w:rStyle w:val="VerbatimChar"/>
-        </w:rPr>
-        <w:t xml:space="preserve">outputs/final_multiday/statistical_tests.json</w:t>
-      </w:r>
-      <w:r>
-        <w:t xml:space="preserve"> </w:t>
-      </w:r>
-      <w:r>
-        <w:t xml:space="preserve">and</w:t>
-      </w:r>
-      <w:r>
-        <w:t xml:space="preserve"> </w:t>
-      </w:r>
-      <w:r>
-        <w:rPr>
-          <w:rStyle w:val="VerbatimChar"/>
-        </w:rPr>
-        <w:t xml:space="preserve">outputs/final_risk/risk_metrics.json</w:t>
-      </w:r>
-      <w:r>
-        <w:t xml:space="preserve">. The current high-quality readiness report records</w:t>
-      </w:r>
-      <w:r>
-        <w:t xml:space="preserve"> </w:t>
-      </w:r>
-      <w:r>
-        <w:rPr>
-          <w:rStyle w:val="VerbatimChar"/>
-        </w:rPr>
-        <w:t xml:space="preserve">overall_status=submission_ready_candidate</w:t>
-      </w:r>
-      <w:r>
-        <w:t xml:space="preserve"> </w:t>
-      </w:r>
-      <w:r>
-        <w:t xml:space="preserve">and no blocking gaps at generation time.</w:t>
+        <w:t xml:space="preserve">Figure 1. Reproducible evidence chain used in this study.</w:t>
+      </w:r>
+    </w:p>
+    <w:p>
+      <w:pPr>
+        <w:pStyle w:val="BodyText"/>
+      </w:pPr>
+      <w:r>
+        <w:t xml:space="preserve">The analysis is designed so that manuscript tables and figures remain tied to machine-readable evidence rather than hidden spreadsheet calculations. The main tables and figures are regenerated from the public release’s data manifest, model-metric tables, horizon and group summaries, statistical summaries and risk-warning metrics. The supplementary file lists the machine-readable evidence files used for this manuscript, while the main text reports only the evidence needed to understand and evaluate the navigation claim.</w:t>
       </w:r>
     </w:p>
     <w:p>
@@ -452,13 +763,14 @@
       </w:r>
     </w:p>
     <w:bookmarkEnd w:id="15"/>
-    <w:bookmarkStart w:id="16" w:name="trajectory-prediction-models-and-metrics"/>
+    <w:bookmarkEnd w:id="16"/>
+    <w:bookmarkStart w:id="17" w:name="trajectory-prediction-models-and-metrics"/>
     <w:p>
       <w:pPr>
         <w:pStyle w:val="Heading2"/>
       </w:pPr>
       <w:r>
-        <w:t xml:space="preserve">4. Trajectory Prediction Models and Metrics</w:t>
+        <w:t xml:space="preserve">4. TRAJECTORY PREDICTION MODELS AND METRICS</w:t>
       </w:r>
     </w:p>
     <w:p>
@@ -498,7 +810,7 @@
         <w:pStyle w:val="BodyText"/>
       </w:pPr>
       <w:r>
-        <w:t xml:space="preserve">Paired comparisons are computed against constant velocity because CV is the main operationally meaningful reference. The statistical artifact includes paired t-tests, Wilcoxon tests and Bonferroni-corrected comparison counts. The paper does not overstate these tests. Because AIS errors are highly skewed, the mean and the median tell different stories. In particular, Kalman-CV has very low median ADE in both holdouts but still has large upper-tail errors, which explains why mean ADE remains in kilometres even though the median error is measured in metres.</w:t>
+        <w:t xml:space="preserve">Paired comparisons are computed against constant velocity because CV is the main operationally meaningful reference. The statistical artefact includes paired t-tests, Wilcoxon tests and Bonferroni-corrected comparison counts. The paper does not overstate these tests. Because AIS errors are highly skewed, the mean and the median tell different stories. In particular, Kalman-CV has very low median ADE in both holdouts but still has large upper-tail errors, which explains why mean ADE remains in kilometres even though the median error is measured in metres.</w:t>
       </w:r>
     </w:p>
     <w:p>
@@ -509,14 +821,14 @@
         <w:t xml:space="preserve">The modelling protocol also records neural tuning separately from final test claims. The neural proxy search provides reviewer transparency about the limited validation configurations explored, but final conclusions remain tied to the full-split test metrics. This separation matters because using test performance to tune neural models would undermine the benchmark. The present neural results are therefore best read as baseline outcomes under documented settings, not as a final word on neural maritime forecasting.</w:t>
       </w:r>
     </w:p>
-    <w:bookmarkEnd w:id="16"/>
-    <w:bookmarkStart w:id="17" w:name="Xe9530d0f79a43ac325a80de31453f6d39c53d9e"/>
+    <w:bookmarkEnd w:id="17"/>
+    <w:bookmarkStart w:id="18" w:name="Xe9530d0f79a43ac325a80de31453f6d39c53d9e"/>
     <w:p>
       <w:pPr>
         <w:pStyle w:val="Heading2"/>
       </w:pPr>
       <w:r>
-        <w:t xml:space="preserve">5. Generalisation and Risk-Warning Evaluation</w:t>
+        <w:t xml:space="preserve">5. GENERALISATION AND RISK-WARNING EVALUATION</w:t>
       </w:r>
     </w:p>
     <w:p>
@@ -532,7 +844,15 @@
         <w:pStyle w:val="BodyText"/>
       </w:pPr>
       <w:r>
-        <w:t xml:space="preserve">For downstream risk-warning evaluation, the benchmark selects AIS-derived encounter scenarios from the temporal test setting. Observed future trajectories define the truth warning label: a warning is positive if the observed minimum CPA over the forecast horizon crosses the configured threshold. Predicted trajectories are then used to compute predicted CPA/TCPA warnings. This yields true positives, false positives, false negatives and true negatives. The warning metrics are precision, recall, false-alarm rate, missed-warning rate, mean absolute lead-time error and mean absolute CPA error.</w:t>
+        <w:t xml:space="preserve">For downstream risk-warning evaluation, the benchmark selects AIS-derived encounter scenarios from the temporal test setting. The scenario builder scans the first 5,000 temporal-test samples, groups windows that share the same start time, and pairs vessels whose origin positions are within 3.0 nautical miles. The reported scenarios are paired-vessel cases rather than single-trajectory examples. For each pair, the observed future trajectories define the truth warning label: a warning is positive if the discrete minimum separation over the 15 one-minute future positions is no greater than 0.5 nautical miles. Predicted trajectories are processed with the same discrete CPA/TCPA calculation to obtain model-level warning labels.</w:t>
+      </w:r>
+    </w:p>
+    <w:p>
+      <w:pPr>
+        <w:pStyle w:val="BodyText"/>
+      </w:pPr>
+      <w:r>
+        <w:t xml:space="preserve">The discrete CPA/TCPA calculation deliberately matches the sampled forecast horizon rather than a continuous relative-motion formula. For each scenario and model, the comparison yields true positives, false positives, false negatives and true negatives. Lead-time error is computed when both observed and predicted futures cross the warning threshold, and CPA error is the absolute difference between predicted and observed minimum separation in nautical miles. The warning metrics are precision, recall, false-alarm rate, missed-warning rate, mean absolute lead-time error and mean absolute CPA error.</w:t>
       </w:r>
     </w:p>
     <w:p>
@@ -559,14 +879,14 @@
         <w:t xml:space="preserve">The warning threshold is intentionally fixed rather than optimised per model. Optimising a different threshold for every model could improve individual scores, but it would make the comparison less transparent. A fixed threshold gives reviewers a stable basis for interpreting the confusion matrices. Alternative thresholds are a reasonable future sensitivity study and can be added without changing the rest of the evidence pipeline.</w:t>
       </w:r>
     </w:p>
-    <w:bookmarkEnd w:id="17"/>
-    <w:bookmarkStart w:id="33" w:name="results"/>
+    <w:bookmarkEnd w:id="18"/>
+    <w:bookmarkStart w:id="34" w:name="results"/>
     <w:p>
       <w:pPr>
         <w:pStyle w:val="Heading2"/>
       </w:pPr>
       <w:r>
-        <w:t xml:space="preserve">6. Results</w:t>
+        <w:t xml:space="preserve">6. RESULTS</w:t>
       </w:r>
     </w:p>
     <w:p>
@@ -586,18 +906,18 @@
           <wp:inline>
             <wp:extent cx="5334000" cy="2713218"/>
             <wp:effectExtent b="0" l="0" r="0" t="0"/>
-            <wp:docPr descr="Figure 2. ADE comparison across temporal and vessel-disjoint holdouts. The log scale is used because neural and acceleration baselines have much larger errors than the strongest kinematic models." title="" id="19" name="Picture"/>
+            <wp:docPr descr="Figure 2. ADE comparison across temporal and vessel-disjoint holdouts. The log scale is used because neural and acceleration baselines have much larger errors than the strongest kinematic models." title="" id="20" name="Picture"/>
             <a:graphic>
               <a:graphicData uri="http://schemas.openxmlformats.org/drawingml/2006/picture">
                 <pic:pic>
                   <pic:nvPicPr>
-                    <pic:cNvPr descr="figures/jon_model_performance.png" id="20" name="Picture"/>
+                    <pic:cNvPr descr="figures/jon_model_performance.png" id="21" name="Picture"/>
                     <pic:cNvPicPr>
                       <a:picLocks noChangeArrowheads="1" noChangeAspect="1"/>
                     </pic:cNvPicPr>
                   </pic:nvPicPr>
                   <pic:blipFill>
-                    <a:blip r:embed="rId18"/>
+                    <a:blip r:embed="rId19"/>
                     <a:stretch>
                       <a:fillRect/>
                     </a:stretch>
@@ -637,15 +957,15 @@
         <w:pStyle w:val="BodyText"/>
       </w:pPr>
       <w:r>
-        <w:t xml:space="preserve">Table 1 gives the numerical trajectory results. The distinction between mean and median is important. For example, Kalman-CV has median ADE 8.2 m on the temporal holdout and 9.2 m on the vessel-disjoint holdout, while its mean ADE remains much larger. This pattern is consistent with many short windows being easy and a smaller number of windows being difficult due to manoeuvres, sparse/interpolated reporting, regional geometry or other traffic effects.</w:t>
-      </w:r>
-    </w:p>
-    <w:p>
-      <w:pPr>
-        <w:pStyle w:val="BodyText"/>
-      </w:pPr>
-      <w:r>
-        <w:t xml:space="preserve">Table 1. Trajectory-prediction metrics generated from the current non-debug evidence pack.</w:t>
+        <w:t xml:space="preserve">Table 2 gives the numerical trajectory results. The distinction between mean and median is important. For example, Kalman-CV has median ADE 8.2 m on the temporal holdout and 9.2 m on the vessel-disjoint holdout, while its mean ADE remains much larger. This pattern is consistent with many short windows being easy and a smaller number of windows being difficult due to manoeuvres, sparse/interpolated reporting, regional geometry or other traffic effects.</w:t>
+      </w:r>
+    </w:p>
+    <w:p>
+      <w:pPr>
+        <w:pStyle w:val="BodyText"/>
+      </w:pPr>
+      <w:r>
+        <w:t xml:space="preserve">Table 2. Trajectory-prediction metrics generated from the reported benchmark evidence package.</w:t>
       </w:r>
     </w:p>
     <w:tbl>
@@ -2040,15 +2360,916 @@
         <w:pStyle w:val="BodyText"/>
       </w:pPr>
       <w:r>
-        <w:t xml:space="preserve">The neural baselines should be interpreted carefully. The Transformer baseline records 56,310.7 m temporal ADE in the current run, and the other neural baselines are also far above the strongest kinematic and linear baselines. This is not evidence that neural AIS prediction is impossible. It is evidence that naive neural baselines can fail under this exact preprocessing and split protocol. The useful publication claim is therefore methodological: strong baselines, documented tuning, split discipline and downstream warning evaluation are necessary before asserting architecture superiority.</w:t>
-      </w:r>
-    </w:p>
-    <w:p>
-      <w:pPr>
-        <w:pStyle w:val="BodyText"/>
-      </w:pPr>
-      <w:r>
-        <w:t xml:space="preserve">The constant-acceleration result is also instructive. Although acceleration may appear to be a richer physical assumption than constant velocity, it performs very poorly in the current aggregate metrics. This likely reflects the sensitivity of acceleration estimates to noisy or interpolated short-window position changes. For navigation applications, a physically plausible model family still needs to be numerically stable under the reporting characteristics of AIS. More parameters are not automatically better when the observations are irregular and manoeuvres are sparse.</w:t>
+        <w:t xml:space="preserve">Table 3 expands this point for the strongest kinematic and linear baselines. The P99 values are much larger than the medians, so the kilometre-scale means are driven by a small but important tail of difficult windows. The 1 percent trimmed means are far lower than the untrimmed means, which supports interpreting the aggregate results as a mixture of many easy short-horizon cases and a small set of manoeuvre, reporting, interpolation or regional edge cases.</w:t>
+      </w:r>
+    </w:p>
+    <w:p>
+      <w:pPr>
+        <w:pStyle w:val="BodyText"/>
+      </w:pPr>
+      <w:r>
+        <w:t xml:space="preserve">Table 3. Tail-error diagnostics for selected baselines.</w:t>
+      </w:r>
+    </w:p>
+    <w:tbl>
+      <w:tblPr>
+        <w:tblStyle w:val="Table"/>
+        <w:tblW w:type="pct" w:w="5000"/>
+        <w:tblLayout w:type="fixed"/>
+        <w:tblLook w:firstRow="1" w:lastRow="0" w:firstColumn="0" w:lastColumn="0" w:noHBand="0" w:noVBand="0" w:val="0020"/>
+      </w:tblPr>
+      <w:tblGrid>
+        <w:gridCol w:w="792"/>
+        <w:gridCol w:w="792"/>
+        <w:gridCol w:w="1056"/>
+        <w:gridCol w:w="1056"/>
+        <w:gridCol w:w="1056"/>
+        <w:gridCol w:w="1056"/>
+        <w:gridCol w:w="1056"/>
+        <w:gridCol w:w="1056"/>
+      </w:tblGrid>
+      <w:tr>
+        <w:trPr>
+          <w:tblHeader w:val="on"/>
+        </w:trPr>
+        <w:tc>
+          <w:tcPr/>
+          <w:p>
+            <w:pPr>
+              <w:pStyle w:val="Compact"/>
+            </w:pPr>
+            <w:r>
+              <w:t xml:space="preserve">Split</w:t>
+            </w:r>
+          </w:p>
+        </w:tc>
+        <w:tc>
+          <w:tcPr/>
+          <w:p>
+            <w:pPr>
+              <w:pStyle w:val="Compact"/>
+            </w:pPr>
+            <w:r>
+              <w:t xml:space="preserve">Model</w:t>
+            </w:r>
+          </w:p>
+        </w:tc>
+        <w:tc>
+          <w:tcPr/>
+          <w:p>
+            <w:pPr>
+              <w:pStyle w:val="Compact"/>
+              <w:jc w:val="right"/>
+            </w:pPr>
+            <w:r>
+              <w:t xml:space="preserve">P50 ADE</w:t>
+            </w:r>
+          </w:p>
+        </w:tc>
+        <w:tc>
+          <w:tcPr/>
+          <w:p>
+            <w:pPr>
+              <w:pStyle w:val="Compact"/>
+              <w:jc w:val="right"/>
+            </w:pPr>
+            <w:r>
+              <w:t xml:space="preserve">P90 ADE</w:t>
+            </w:r>
+          </w:p>
+        </w:tc>
+        <w:tc>
+          <w:tcPr/>
+          <w:p>
+            <w:pPr>
+              <w:pStyle w:val="Compact"/>
+              <w:jc w:val="right"/>
+            </w:pPr>
+            <w:r>
+              <w:t xml:space="preserve">P95 ADE</w:t>
+            </w:r>
+          </w:p>
+        </w:tc>
+        <w:tc>
+          <w:tcPr/>
+          <w:p>
+            <w:pPr>
+              <w:pStyle w:val="Compact"/>
+              <w:jc w:val="right"/>
+            </w:pPr>
+            <w:r>
+              <w:t xml:space="preserve">P99 ADE</w:t>
+            </w:r>
+          </w:p>
+        </w:tc>
+        <w:tc>
+          <w:tcPr/>
+          <w:p>
+            <w:pPr>
+              <w:pStyle w:val="Compact"/>
+              <w:jc w:val="right"/>
+            </w:pPr>
+            <w:r>
+              <w:t xml:space="preserve">Mean ADE</w:t>
+            </w:r>
+          </w:p>
+        </w:tc>
+        <w:tc>
+          <w:tcPr/>
+          <w:p>
+            <w:pPr>
+              <w:pStyle w:val="Compact"/>
+              <w:jc w:val="right"/>
+            </w:pPr>
+            <w:r>
+              <w:t xml:space="preserve">1% trimmed mean</w:t>
+            </w:r>
+          </w:p>
+        </w:tc>
+      </w:tr>
+      <w:tr>
+        <w:tc>
+          <w:tcPr/>
+          <w:p>
+            <w:pPr>
+              <w:pStyle w:val="Compact"/>
+            </w:pPr>
+            <w:r>
+              <w:t xml:space="preserve">Temporal holdout</w:t>
+            </w:r>
+          </w:p>
+        </w:tc>
+        <w:tc>
+          <w:tcPr/>
+          <w:p>
+            <w:pPr>
+              <w:pStyle w:val="Compact"/>
+            </w:pPr>
+            <w:r>
+              <w:t xml:space="preserve">Kalman-CV</w:t>
+            </w:r>
+          </w:p>
+        </w:tc>
+        <w:tc>
+          <w:tcPr/>
+          <w:p>
+            <w:pPr>
+              <w:pStyle w:val="Compact"/>
+              <w:jc w:val="right"/>
+            </w:pPr>
+            <w:r>
+              <w:t xml:space="preserve">8.2</w:t>
+            </w:r>
+          </w:p>
+        </w:tc>
+        <w:tc>
+          <w:tcPr/>
+          <w:p>
+            <w:pPr>
+              <w:pStyle w:val="Compact"/>
+              <w:jc w:val="right"/>
+            </w:pPr>
+            <w:r>
+              <w:t xml:space="preserve">1,009.7</w:t>
+            </w:r>
+          </w:p>
+        </w:tc>
+        <w:tc>
+          <w:tcPr/>
+          <w:p>
+            <w:pPr>
+              <w:pStyle w:val="Compact"/>
+              <w:jc w:val="right"/>
+            </w:pPr>
+            <w:r>
+              <w:t xml:space="preserve">2,120.6</w:t>
+            </w:r>
+          </w:p>
+        </w:tc>
+        <w:tc>
+          <w:tcPr/>
+          <w:p>
+            <w:pPr>
+              <w:pStyle w:val="Compact"/>
+              <w:jc w:val="right"/>
+            </w:pPr>
+            <w:r>
+              <w:t xml:space="preserve">34,576.1</w:t>
+            </w:r>
+          </w:p>
+        </w:tc>
+        <w:tc>
+          <w:tcPr/>
+          <w:p>
+            <w:pPr>
+              <w:pStyle w:val="Compact"/>
+              <w:jc w:val="right"/>
+            </w:pPr>
+            <w:r>
+              <w:t xml:space="preserve">1,759.7</w:t>
+            </w:r>
+          </w:p>
+        </w:tc>
+        <w:tc>
+          <w:tcPr/>
+          <w:p>
+            <w:pPr>
+              <w:pStyle w:val="Compact"/>
+              <w:jc w:val="right"/>
+            </w:pPr>
+            <w:r>
+              <w:t xml:space="preserve">484.0</w:t>
+            </w:r>
+          </w:p>
+        </w:tc>
+      </w:tr>
+      <w:tr>
+        <w:tc>
+          <w:tcPr/>
+          <w:p>
+            <w:pPr>
+              <w:pStyle w:val="Compact"/>
+            </w:pPr>
+            <w:r>
+              <w:t xml:space="preserve">Temporal holdout</w:t>
+            </w:r>
+          </w:p>
+        </w:tc>
+        <w:tc>
+          <w:tcPr/>
+          <w:p>
+            <w:pPr>
+              <w:pStyle w:val="Compact"/>
+            </w:pPr>
+            <w:r>
+              <w:t xml:space="preserve">CV</w:t>
+            </w:r>
+          </w:p>
+        </w:tc>
+        <w:tc>
+          <w:tcPr/>
+          <w:p>
+            <w:pPr>
+              <w:pStyle w:val="Compact"/>
+              <w:jc w:val="right"/>
+            </w:pPr>
+            <w:r>
+              <w:t xml:space="preserve">20.5</w:t>
+            </w:r>
+          </w:p>
+        </w:tc>
+        <w:tc>
+          <w:tcPr/>
+          <w:p>
+            <w:pPr>
+              <w:pStyle w:val="Compact"/>
+              <w:jc w:val="right"/>
+            </w:pPr>
+            <w:r>
+              <w:t xml:space="preserve">998.8</w:t>
+            </w:r>
+          </w:p>
+        </w:tc>
+        <w:tc>
+          <w:tcPr/>
+          <w:p>
+            <w:pPr>
+              <w:pStyle w:val="Compact"/>
+              <w:jc w:val="right"/>
+            </w:pPr>
+            <w:r>
+              <w:t xml:space="preserve">1,990.6</w:t>
+            </w:r>
+          </w:p>
+        </w:tc>
+        <w:tc>
+          <w:tcPr/>
+          <w:p>
+            <w:pPr>
+              <w:pStyle w:val="Compact"/>
+              <w:jc w:val="right"/>
+            </w:pPr>
+            <w:r>
+              <w:t xml:space="preserve">34,946.8</w:t>
+            </w:r>
+          </w:p>
+        </w:tc>
+        <w:tc>
+          <w:tcPr/>
+          <w:p>
+            <w:pPr>
+              <w:pStyle w:val="Compact"/>
+              <w:jc w:val="right"/>
+            </w:pPr>
+            <w:r>
+              <w:t xml:space="preserve">2,751.3</w:t>
+            </w:r>
+          </w:p>
+        </w:tc>
+        <w:tc>
+          <w:tcPr/>
+          <w:p>
+            <w:pPr>
+              <w:pStyle w:val="Compact"/>
+              <w:jc w:val="right"/>
+            </w:pPr>
+            <w:r>
+              <w:t xml:space="preserve">482.0</w:t>
+            </w:r>
+          </w:p>
+        </w:tc>
+      </w:tr>
+      <w:tr>
+        <w:tc>
+          <w:tcPr/>
+          <w:p>
+            <w:pPr>
+              <w:pStyle w:val="Compact"/>
+            </w:pPr>
+            <w:r>
+              <w:t xml:space="preserve">Temporal holdout</w:t>
+            </w:r>
+          </w:p>
+        </w:tc>
+        <w:tc>
+          <w:tcPr/>
+          <w:p>
+            <w:pPr>
+              <w:pStyle w:val="Compact"/>
+            </w:pPr>
+            <w:r>
+              <w:t xml:space="preserve">Ridge</w:t>
+            </w:r>
+          </w:p>
+        </w:tc>
+        <w:tc>
+          <w:tcPr/>
+          <w:p>
+            <w:pPr>
+              <w:pStyle w:val="Compact"/>
+              <w:jc w:val="right"/>
+            </w:pPr>
+            <w:r>
+              <w:t xml:space="preserve">1,563.1</w:t>
+            </w:r>
+          </w:p>
+        </w:tc>
+        <w:tc>
+          <w:tcPr/>
+          <w:p>
+            <w:pPr>
+              <w:pStyle w:val="Compact"/>
+              <w:jc w:val="right"/>
+            </w:pPr>
+            <w:r>
+              <w:t xml:space="preserve">2,934.6</w:t>
+            </w:r>
+          </w:p>
+        </w:tc>
+        <w:tc>
+          <w:tcPr/>
+          <w:p>
+            <w:pPr>
+              <w:pStyle w:val="Compact"/>
+              <w:jc w:val="right"/>
+            </w:pPr>
+            <w:r>
+              <w:t xml:space="preserve">4,857.6</w:t>
+            </w:r>
+          </w:p>
+        </w:tc>
+        <w:tc>
+          <w:tcPr/>
+          <w:p>
+            <w:pPr>
+              <w:pStyle w:val="Compact"/>
+              <w:jc w:val="right"/>
+            </w:pPr>
+            <w:r>
+              <w:t xml:space="preserve">39,372.3</w:t>
+            </w:r>
+          </w:p>
+        </w:tc>
+        <w:tc>
+          <w:tcPr/>
+          <w:p>
+            <w:pPr>
+              <w:pStyle w:val="Compact"/>
+              <w:jc w:val="right"/>
+            </w:pPr>
+            <w:r>
+              <w:t xml:space="preserve">3,141.7</w:t>
+            </w:r>
+          </w:p>
+        </w:tc>
+        <w:tc>
+          <w:tcPr/>
+          <w:p>
+            <w:pPr>
+              <w:pStyle w:val="Compact"/>
+              <w:jc w:val="right"/>
+            </w:pPr>
+            <w:r>
+              <w:t xml:space="preserve">2,057.0</w:t>
+            </w:r>
+          </w:p>
+        </w:tc>
+      </w:tr>
+      <w:tr>
+        <w:tc>
+          <w:tcPr/>
+          <w:p>
+            <w:pPr>
+              <w:pStyle w:val="Compact"/>
+            </w:pPr>
+            <w:r>
+              <w:t xml:space="preserve">Temporal holdout</w:t>
+            </w:r>
+          </w:p>
+        </w:tc>
+        <w:tc>
+          <w:tcPr/>
+          <w:p>
+            <w:pPr>
+              <w:pStyle w:val="Compact"/>
+            </w:pPr>
+            <w:r>
+              <w:t xml:space="preserve">OLS</w:t>
+            </w:r>
+          </w:p>
+        </w:tc>
+        <w:tc>
+          <w:tcPr/>
+          <w:p>
+            <w:pPr>
+              <w:pStyle w:val="Compact"/>
+              <w:jc w:val="right"/>
+            </w:pPr>
+            <w:r>
+              <w:t xml:space="preserve">1,439.3</w:t>
+            </w:r>
+          </w:p>
+        </w:tc>
+        <w:tc>
+          <w:tcPr/>
+          <w:p>
+            <w:pPr>
+              <w:pStyle w:val="Compact"/>
+              <w:jc w:val="right"/>
+            </w:pPr>
+            <w:r>
+              <w:t xml:space="preserve">2,767.1</w:t>
+            </w:r>
+          </w:p>
+        </w:tc>
+        <w:tc>
+          <w:tcPr/>
+          <w:p>
+            <w:pPr>
+              <w:pStyle w:val="Compact"/>
+              <w:jc w:val="right"/>
+            </w:pPr>
+            <w:r>
+              <w:t xml:space="preserve">4,916.5</w:t>
+            </w:r>
+          </w:p>
+        </w:tc>
+        <w:tc>
+          <w:tcPr/>
+          <w:p>
+            <w:pPr>
+              <w:pStyle w:val="Compact"/>
+              <w:jc w:val="right"/>
+            </w:pPr>
+            <w:r>
+              <w:t xml:space="preserve">36,361.0</w:t>
+            </w:r>
+          </w:p>
+        </w:tc>
+        <w:tc>
+          <w:tcPr/>
+          <w:p>
+            <w:pPr>
+              <w:pStyle w:val="Compact"/>
+              <w:jc w:val="right"/>
+            </w:pPr>
+            <w:r>
+              <w:t xml:space="preserve">3,052.3</w:t>
+            </w:r>
+          </w:p>
+        </w:tc>
+        <w:tc>
+          <w:tcPr/>
+          <w:p>
+            <w:pPr>
+              <w:pStyle w:val="Compact"/>
+              <w:jc w:val="right"/>
+            </w:pPr>
+            <w:r>
+              <w:t xml:space="preserve">1,933.4</w:t>
+            </w:r>
+          </w:p>
+        </w:tc>
+      </w:tr>
+      <w:tr>
+        <w:tc>
+          <w:tcPr/>
+          <w:p>
+            <w:pPr>
+              <w:pStyle w:val="Compact"/>
+            </w:pPr>
+            <w:r>
+              <w:t xml:space="preserve">Vessel-disjoint holdout</w:t>
+            </w:r>
+          </w:p>
+        </w:tc>
+        <w:tc>
+          <w:tcPr/>
+          <w:p>
+            <w:pPr>
+              <w:pStyle w:val="Compact"/>
+            </w:pPr>
+            <w:r>
+              <w:t xml:space="preserve">Kalman-CV</w:t>
+            </w:r>
+          </w:p>
+        </w:tc>
+        <w:tc>
+          <w:tcPr/>
+          <w:p>
+            <w:pPr>
+              <w:pStyle w:val="Compact"/>
+              <w:jc w:val="right"/>
+            </w:pPr>
+            <w:r>
+              <w:t xml:space="preserve">9.2</w:t>
+            </w:r>
+          </w:p>
+        </w:tc>
+        <w:tc>
+          <w:tcPr/>
+          <w:p>
+            <w:pPr>
+              <w:pStyle w:val="Compact"/>
+              <w:jc w:val="right"/>
+            </w:pPr>
+            <w:r>
+              <w:t xml:space="preserve">1,197.7</w:t>
+            </w:r>
+          </w:p>
+        </w:tc>
+        <w:tc>
+          <w:tcPr/>
+          <w:p>
+            <w:pPr>
+              <w:pStyle w:val="Compact"/>
+              <w:jc w:val="right"/>
+            </w:pPr>
+            <w:r>
+              <w:t xml:space="preserve">3,186.6</w:t>
+            </w:r>
+          </w:p>
+        </w:tc>
+        <w:tc>
+          <w:tcPr/>
+          <w:p>
+            <w:pPr>
+              <w:pStyle w:val="Compact"/>
+              <w:jc w:val="right"/>
+            </w:pPr>
+            <w:r>
+              <w:t xml:space="preserve">46,157.6</w:t>
+            </w:r>
+          </w:p>
+        </w:tc>
+        <w:tc>
+          <w:tcPr/>
+          <w:p>
+            <w:pPr>
+              <w:pStyle w:val="Compact"/>
+              <w:jc w:val="right"/>
+            </w:pPr>
+            <w:r>
+              <w:t xml:space="preserve">3,109.4</w:t>
+            </w:r>
+          </w:p>
+        </w:tc>
+        <w:tc>
+          <w:tcPr/>
+          <w:p>
+            <w:pPr>
+              <w:pStyle w:val="Compact"/>
+              <w:jc w:val="right"/>
+            </w:pPr>
+            <w:r>
+              <w:t xml:space="preserve">753.2</w:t>
+            </w:r>
+          </w:p>
+        </w:tc>
+      </w:tr>
+      <w:tr>
+        <w:tc>
+          <w:tcPr/>
+          <w:p>
+            <w:pPr>
+              <w:pStyle w:val="Compact"/>
+            </w:pPr>
+            <w:r>
+              <w:t xml:space="preserve">Vessel-disjoint holdout</w:t>
+            </w:r>
+          </w:p>
+        </w:tc>
+        <w:tc>
+          <w:tcPr/>
+          <w:p>
+            <w:pPr>
+              <w:pStyle w:val="Compact"/>
+            </w:pPr>
+            <w:r>
+              <w:t xml:space="preserve">CV</w:t>
+            </w:r>
+          </w:p>
+        </w:tc>
+        <w:tc>
+          <w:tcPr/>
+          <w:p>
+            <w:pPr>
+              <w:pStyle w:val="Compact"/>
+              <w:jc w:val="right"/>
+            </w:pPr>
+            <w:r>
+              <w:t xml:space="preserve">22.8</w:t>
+            </w:r>
+          </w:p>
+        </w:tc>
+        <w:tc>
+          <w:tcPr/>
+          <w:p>
+            <w:pPr>
+              <w:pStyle w:val="Compact"/>
+              <w:jc w:val="right"/>
+            </w:pPr>
+            <w:r>
+              <w:t xml:space="preserve">1,203.2</w:t>
+            </w:r>
+          </w:p>
+        </w:tc>
+        <w:tc>
+          <w:tcPr/>
+          <w:p>
+            <w:pPr>
+              <w:pStyle w:val="Compact"/>
+              <w:jc w:val="right"/>
+            </w:pPr>
+            <w:r>
+              <w:t xml:space="preserve">2,991.4</w:t>
+            </w:r>
+          </w:p>
+        </w:tc>
+        <w:tc>
+          <w:tcPr/>
+          <w:p>
+            <w:pPr>
+              <w:pStyle w:val="Compact"/>
+              <w:jc w:val="right"/>
+            </w:pPr>
+            <w:r>
+              <w:t xml:space="preserve">46,265.6</w:t>
+            </w:r>
+          </w:p>
+        </w:tc>
+        <w:tc>
+          <w:tcPr/>
+          <w:p>
+            <w:pPr>
+              <w:pStyle w:val="Compact"/>
+              <w:jc w:val="right"/>
+            </w:pPr>
+            <w:r>
+              <w:t xml:space="preserve">9,553.5</w:t>
+            </w:r>
+          </w:p>
+        </w:tc>
+        <w:tc>
+          <w:tcPr/>
+          <w:p>
+            <w:pPr>
+              <w:pStyle w:val="Compact"/>
+              <w:jc w:val="right"/>
+            </w:pPr>
+            <w:r>
+              <w:t xml:space="preserve">759.5</w:t>
+            </w:r>
+          </w:p>
+        </w:tc>
+      </w:tr>
+      <w:tr>
+        <w:tc>
+          <w:tcPr/>
+          <w:p>
+            <w:pPr>
+              <w:pStyle w:val="Compact"/>
+            </w:pPr>
+            <w:r>
+              <w:t xml:space="preserve">Vessel-disjoint holdout</w:t>
+            </w:r>
+          </w:p>
+        </w:tc>
+        <w:tc>
+          <w:tcPr/>
+          <w:p>
+            <w:pPr>
+              <w:pStyle w:val="Compact"/>
+            </w:pPr>
+            <w:r>
+              <w:t xml:space="preserve">Ridge</w:t>
+            </w:r>
+          </w:p>
+        </w:tc>
+        <w:tc>
+          <w:tcPr/>
+          <w:p>
+            <w:pPr>
+              <w:pStyle w:val="Compact"/>
+              <w:jc w:val="right"/>
+            </w:pPr>
+            <w:r>
+              <w:t xml:space="preserve">1,277.5</w:t>
+            </w:r>
+          </w:p>
+        </w:tc>
+        <w:tc>
+          <w:tcPr/>
+          <w:p>
+            <w:pPr>
+              <w:pStyle w:val="Compact"/>
+              <w:jc w:val="right"/>
+            </w:pPr>
+            <w:r>
+              <w:t xml:space="preserve">2,516.6</w:t>
+            </w:r>
+          </w:p>
+        </w:tc>
+        <w:tc>
+          <w:tcPr/>
+          <w:p>
+            <w:pPr>
+              <w:pStyle w:val="Compact"/>
+              <w:jc w:val="right"/>
+            </w:pPr>
+            <w:r>
+              <w:t xml:space="preserve">4,391.9</w:t>
+            </w:r>
+          </w:p>
+        </w:tc>
+        <w:tc>
+          <w:tcPr/>
+          <w:p>
+            <w:pPr>
+              <w:pStyle w:val="Compact"/>
+              <w:jc w:val="right"/>
+            </w:pPr>
+            <w:r>
+              <w:t xml:space="preserve">47,065.1</w:t>
+            </w:r>
+          </w:p>
+        </w:tc>
+        <w:tc>
+          <w:tcPr/>
+          <w:p>
+            <w:pPr>
+              <w:pStyle w:val="Compact"/>
+              <w:jc w:val="right"/>
+            </w:pPr>
+            <w:r>
+              <w:t xml:space="preserve">3,446.9</w:t>
+            </w:r>
+          </w:p>
+        </w:tc>
+        <w:tc>
+          <w:tcPr/>
+          <w:p>
+            <w:pPr>
+              <w:pStyle w:val="Compact"/>
+              <w:jc w:val="right"/>
+            </w:pPr>
+            <w:r>
+              <w:t xml:space="preserve">1,875.4</w:t>
+            </w:r>
+          </w:p>
+        </w:tc>
+      </w:tr>
+      <w:tr>
+        <w:tc>
+          <w:tcPr/>
+          <w:p>
+            <w:pPr>
+              <w:pStyle w:val="Compact"/>
+            </w:pPr>
+            <w:r>
+              <w:t xml:space="preserve">Vessel-disjoint holdout</w:t>
+            </w:r>
+          </w:p>
+        </w:tc>
+        <w:tc>
+          <w:tcPr/>
+          <w:p>
+            <w:pPr>
+              <w:pStyle w:val="Compact"/>
+            </w:pPr>
+            <w:r>
+              <w:t xml:space="preserve">OLS</w:t>
+            </w:r>
+          </w:p>
+        </w:tc>
+        <w:tc>
+          <w:tcPr/>
+          <w:p>
+            <w:pPr>
+              <w:pStyle w:val="Compact"/>
+              <w:jc w:val="right"/>
+            </w:pPr>
+            <w:r>
+              <w:t xml:space="preserve">930.0</w:t>
+            </w:r>
+          </w:p>
+        </w:tc>
+        <w:tc>
+          <w:tcPr/>
+          <w:p>
+            <w:pPr>
+              <w:pStyle w:val="Compact"/>
+              <w:jc w:val="right"/>
+            </w:pPr>
+            <w:r>
+              <w:t xml:space="preserve">2,229.2</w:t>
+            </w:r>
+          </w:p>
+        </w:tc>
+        <w:tc>
+          <w:tcPr/>
+          <w:p>
+            <w:pPr>
+              <w:pStyle w:val="Compact"/>
+              <w:jc w:val="right"/>
+            </w:pPr>
+            <w:r>
+              <w:t xml:space="preserve">4,131.3</w:t>
+            </w:r>
+          </w:p>
+        </w:tc>
+        <w:tc>
+          <w:tcPr/>
+          <w:p>
+            <w:pPr>
+              <w:pStyle w:val="Compact"/>
+              <w:jc w:val="right"/>
+            </w:pPr>
+            <w:r>
+              <w:t xml:space="preserve">47,434.3</w:t>
+            </w:r>
+          </w:p>
+        </w:tc>
+        <w:tc>
+          <w:tcPr/>
+          <w:p>
+            <w:pPr>
+              <w:pStyle w:val="Compact"/>
+              <w:jc w:val="right"/>
+            </w:pPr>
+            <w:r>
+              <w:t xml:space="preserve">8,113.3</w:t>
+            </w:r>
+          </w:p>
+        </w:tc>
+        <w:tc>
+          <w:tcPr/>
+          <w:p>
+            <w:pPr>
+              <w:pStyle w:val="Compact"/>
+              <w:jc w:val="right"/>
+            </w:pPr>
+            <w:r>
+              <w:t xml:space="preserve">1,564.0</w:t>
+            </w:r>
+          </w:p>
+        </w:tc>
+      </w:tr>
+    </w:tbl>
+    <w:p>
+      <w:pPr>
+        <w:pStyle w:val="BodyText"/>
+      </w:pPr>
+      <w:r>
+        <w:t xml:space="preserve">The neural baselines should be interpreted carefully. The Transformer baseline records 56,310.7 m temporal ADE in the reported run, and the other neural baselines are also far above the strongest kinematic and linear baselines. This is not evidence that neural AIS prediction is impossible. Under the documented baseline configurations and preprocessing protocol, the neural sequence baselines did not outperform the strongest kinematic baselines. The useful publication claim is therefore methodological: strong baselines, documented tuning, split discipline and downstream warning evaluation are necessary before asserting architecture superiority. The selected neural configurations and validation proxy-search summary are reported in Supplementary File S1.</w:t>
+      </w:r>
+    </w:p>
+    <w:p>
+      <w:pPr>
+        <w:pStyle w:val="BodyText"/>
+      </w:pPr>
+      <w:r>
+        <w:t xml:space="preserve">The constant-acceleration result is also instructive. Although acceleration may appear to be a richer physical assumption than constant velocity, it performs very poorly in the reported aggregate metrics. This likely reflects the sensitivity of acceleration estimates to noisy or interpolated short-window position changes. For navigation applications, a physically plausible model family still needs to be numerically stable under the reporting characteristics of AIS. More parameters are not automatically better when the observations are irregular and manoeuvres are sparse.</w:t>
       </w:r>
     </w:p>
     <w:p>
@@ -2068,18 +3289,18 @@
           <wp:inline>
             <wp:extent cx="5334000" cy="2238815"/>
             <wp:effectExtent b="0" l="0" r="0" t="0"/>
-            <wp:docPr descr="Figure 3. Horizon-wise ADE degradation for selected model families." title="" id="22" name="Picture"/>
+            <wp:docPr descr="Figure 3. Horizon-wise ADE degradation for selected model families." title="" id="23" name="Picture"/>
             <a:graphic>
               <a:graphicData uri="http://schemas.openxmlformats.org/drawingml/2006/picture">
                 <pic:pic>
                   <pic:nvPicPr>
-                    <pic:cNvPr descr="figures/jon_horizon_degradation.png" id="23" name="Picture"/>
+                    <pic:cNvPr descr="figures/jon_horizon_degradation.png" id="24" name="Picture"/>
                     <pic:cNvPicPr>
                       <a:picLocks noChangeArrowheads="1" noChangeAspect="1"/>
                     </pic:cNvPicPr>
                   </pic:nvPicPr>
                   <pic:blipFill>
-                    <a:blip r:embed="rId21"/>
+                    <a:blip r:embed="rId22"/>
                     <a:stretch>
                       <a:fillRect/>
                     </a:stretch>
@@ -2131,18 +3352,18 @@
           <wp:inline>
             <wp:extent cx="5334000" cy="2242889"/>
             <wp:effectExtent b="0" l="0" r="0" t="0"/>
-            <wp:docPr descr="Figure 4. CPA/TCPA warning classification and CPA-error metrics for selected trajectory models." title="" id="25" name="Picture"/>
+            <wp:docPr descr="Figure 4. CPA/TCPA warning classification and CPA-error metrics for selected trajectory models." title="" id="26" name="Picture"/>
             <a:graphic>
               <a:graphicData uri="http://schemas.openxmlformats.org/drawingml/2006/picture">
                 <pic:pic>
                   <pic:nvPicPr>
-                    <pic:cNvPr descr="figures/jon_risk_warning_metrics.png" id="26" name="Picture"/>
+                    <pic:cNvPr descr="figures/jon_risk_warning_metrics.png" id="27" name="Picture"/>
                     <pic:cNvPicPr>
                       <a:picLocks noChangeArrowheads="1" noChangeAspect="1"/>
                     </pic:cNvPicPr>
                   </pic:nvPicPr>
                   <pic:blipFill>
-                    <a:blip r:embed="rId24"/>
+                    <a:blip r:embed="rId25"/>
                     <a:stretch>
                       <a:fillRect/>
                     </a:stretch>
@@ -2182,7 +3403,7 @@
         <w:pStyle w:val="BodyText"/>
       </w:pPr>
       <w:r>
-        <w:t xml:space="preserve">Table 2. AIS-derived risk-warning metrics.</w:t>
+        <w:t xml:space="preserve">Table 4. AIS-derived risk-warning metrics.</w:t>
       </w:r>
     </w:p>
     <w:tbl>
@@ -2193,16 +3414,17 @@
         <w:tblLook w:firstRow="1" w:lastRow="0" w:firstColumn="0" w:lastColumn="0" w:noHBand="0" w:noVBand="0" w:val="0020"/>
       </w:tblPr>
       <w:tblGrid>
-        <w:gridCol w:w="609"/>
-        <w:gridCol w:w="812"/>
-        <w:gridCol w:w="812"/>
-        <w:gridCol w:w="812"/>
-        <w:gridCol w:w="812"/>
-        <w:gridCol w:w="812"/>
-        <w:gridCol w:w="812"/>
-        <w:gridCol w:w="812"/>
-        <w:gridCol w:w="812"/>
-        <w:gridCol w:w="812"/>
+        <w:gridCol w:w="552"/>
+        <w:gridCol w:w="736"/>
+        <w:gridCol w:w="736"/>
+        <w:gridCol w:w="736"/>
+        <w:gridCol w:w="736"/>
+        <w:gridCol w:w="736"/>
+        <w:gridCol w:w="736"/>
+        <w:gridCol w:w="736"/>
+        <w:gridCol w:w="736"/>
+        <w:gridCol w:w="736"/>
+        <w:gridCol w:w="736"/>
       </w:tblGrid>
       <w:tr>
         <w:trPr>
@@ -2323,6 +3545,18 @@
               <w:jc w:val="right"/>
             </w:pPr>
             <w:r>
+              <w:t xml:space="preserve">Lead-time error (min)</w:t>
+            </w:r>
+          </w:p>
+        </w:tc>
+        <w:tc>
+          <w:tcPr/>
+          <w:p>
+            <w:pPr>
+              <w:pStyle w:val="Compact"/>
+              <w:jc w:val="right"/>
+            </w:pPr>
+            <w:r>
               <w:t xml:space="preserve">CPA error (nmi)</w:t>
             </w:r>
           </w:p>
@@ -2444,6 +3678,18 @@
               <w:jc w:val="right"/>
             </w:pPr>
             <w:r>
+              <w:t xml:space="preserve">0.083</w:t>
+            </w:r>
+          </w:p>
+        </w:tc>
+        <w:tc>
+          <w:tcPr/>
+          <w:p>
+            <w:pPr>
+              <w:pStyle w:val="Compact"/>
+              <w:jc w:val="right"/>
+            </w:pPr>
+            <w:r>
               <w:t xml:space="preserve">0.092</w:t>
             </w:r>
           </w:p>
@@ -2565,6 +3811,18 @@
               <w:jc w:val="right"/>
             </w:pPr>
             <w:r>
+              <w:t xml:space="preserve">0.045</w:t>
+            </w:r>
+          </w:p>
+        </w:tc>
+        <w:tc>
+          <w:tcPr/>
+          <w:p>
+            <w:pPr>
+              <w:pStyle w:val="Compact"/>
+              <w:jc w:val="right"/>
+            </w:pPr>
+            <w:r>
               <w:t xml:space="preserve">0.082</w:t>
             </w:r>
           </w:p>
@@ -2686,6 +3944,18 @@
               <w:jc w:val="right"/>
             </w:pPr>
             <w:r>
+              <w:t xml:space="preserve">0.302</w:t>
+            </w:r>
+          </w:p>
+        </w:tc>
+        <w:tc>
+          <w:tcPr/>
+          <w:p>
+            <w:pPr>
+              <w:pStyle w:val="Compact"/>
+              <w:jc w:val="right"/>
+            </w:pPr>
+            <w:r>
               <w:t xml:space="preserve">0.346</w:t>
             </w:r>
           </w:p>
@@ -2697,7 +3967,7 @@
         <w:pStyle w:val="BodyText"/>
       </w:pPr>
       <w:r>
-        <w:t xml:space="preserve">Figure 5 reports scenario-slice sensitivity for speed and region groups on the temporal holdout. The purpose is not to claim complete regional robustness. Instead, the figure makes visible that aggregate results are shaped by traffic composition. Low-speed and high-speed slices can have very different error magnitudes, and regions with fewer samples should be interpreted with greater caution. This supports the paper’s conservative boundary: the current evidence is stronger than a single aggregate benchmark but is not yet a full seasonal or global generalisation study.</w:t>
+        <w:t xml:space="preserve">Figure 5 reports scenario-slice sensitivity for speed and region groups on the temporal holdout. The purpose is not to claim complete regional robustness. Instead, the figure makes visible that aggregate results are shaped by traffic composition. Low-speed and high-speed slices can have very different error magnitudes, and regions with fewer samples should be interpreted with greater caution. This supports the paper’s conservative boundary: the reported evidence is stronger than a single aggregate benchmark but is not yet a full seasonal or global generalisation study.</w:t>
       </w:r>
     </w:p>
     <w:p>
@@ -2717,18 +3987,18 @@
           <wp:inline>
             <wp:extent cx="5334000" cy="2239442"/>
             <wp:effectExtent b="0" l="0" r="0" t="0"/>
-            <wp:docPr descr="Figure 5. Scenario-slice sensitivity by speed bin and region on the temporal holdout." title="" id="28" name="Picture"/>
+            <wp:docPr descr="Figure 5. Scenario-slice sensitivity by speed bin and region on the temporal holdout." title="" id="29" name="Picture"/>
             <a:graphic>
               <a:graphicData uri="http://schemas.openxmlformats.org/drawingml/2006/picture">
                 <pic:pic>
                   <pic:nvPicPr>
-                    <pic:cNvPr descr="figures/jon_scenario_slice_errors.png" id="29" name="Picture"/>
+                    <pic:cNvPr descr="figures/jon_scenario_slice_errors.png" id="30" name="Picture"/>
                     <pic:cNvPicPr>
                       <a:picLocks noChangeArrowheads="1" noChangeAspect="1"/>
                     </pic:cNvPicPr>
                   </pic:nvPicPr>
                   <pic:blipFill>
-                    <a:blip r:embed="rId27"/>
+                    <a:blip r:embed="rId28"/>
                     <a:stretch>
                       <a:fillRect/>
                     </a:stretch>
@@ -2780,18 +4050,18 @@
           <wp:inline>
             <wp:extent cx="5334000" cy="4000500"/>
             <wp:effectExtent b="0" l="0" r="0" t="0"/>
-            <wp:docPr descr="Figure 6. AIS-derived encounter case studies from the risk-warning evaluation." title="" id="31" name="Picture"/>
+            <wp:docPr descr="Figure 6. AIS-derived encounter case studies from the risk-warning evaluation." title="" id="32" name="Picture"/>
             <a:graphic>
               <a:graphicData uri="http://schemas.openxmlformats.org/drawingml/2006/picture">
                 <pic:pic>
                   <pic:nvPicPr>
-                    <pic:cNvPr descr="figures/jon_risk_case_studies.png" id="32" name="Picture"/>
+                    <pic:cNvPr descr="figures/jon_risk_case_studies.png" id="33" name="Picture"/>
                     <pic:cNvPicPr>
                       <a:picLocks noChangeArrowheads="1" noChangeAspect="1"/>
                     </pic:cNvPicPr>
                   </pic:nvPicPr>
                   <pic:blipFill>
-                    <a:blip r:embed="rId30"/>
+                    <a:blip r:embed="rId31"/>
                     <a:stretch>
                       <a:fillRect/>
                     </a:stretch>
@@ -2826,14 +4096,14 @@
         <w:t xml:space="preserve">Figure 6. AIS-derived encounter case studies from the risk-warning evaluation.</w:t>
       </w:r>
     </w:p>
-    <w:bookmarkEnd w:id="33"/>
-    <w:bookmarkStart w:id="34" w:name="discussion"/>
+    <w:bookmarkEnd w:id="34"/>
+    <w:bookmarkStart w:id="35" w:name="discussion"/>
     <w:p>
       <w:pPr>
         <w:pStyle w:val="Heading2"/>
       </w:pPr>
       <w:r>
-        <w:t xml:space="preserve">7. Discussion</w:t>
+        <w:t xml:space="preserve">7. DISCUSSION</w:t>
       </w:r>
     </w:p>
     <w:p>
@@ -2841,55 +4111,125 @@
         <w:pStyle w:val="FirstParagraph"/>
       </w:pPr>
       <w:r>
-        <w:t xml:space="preserve">The main result is conservative but practically useful. A simple, transparent motion model remains difficult to beat for short-horizon AIS forecasting, and a Kalman-style version of that model is the strongest current baseline by ADE under both temporal and vessel-disjoint holdouts. This finding has immediate implications for navigation research. A new AIS prediction model should be compared against well-implemented kinematic baselines, not only against other neural models or weakened classical references. If it fails to improve on those baselines, the paper can still contribute if it explains where the failure occurs and what it reveals about the evaluation protocol.</w:t>
-      </w:r>
-    </w:p>
-    <w:p>
-      <w:pPr>
-        <w:pStyle w:val="BodyText"/>
-      </w:pPr>
-      <w:r>
-        <w:t xml:space="preserve">For a journal such as The Journal of Navigation, the value of this result lies in its operational humility. The paper does not invite readers to accept a black-box architecture because it is fashionable. It asks them to inspect a chain of evidence and to judge whether the claimed support is proportional to the experiment. That posture is well suited to navigation research, where a premature claim can be less useful than a carefully bounded benchmark that others can extend.</w:t>
-      </w:r>
-    </w:p>
-    <w:p>
-      <w:pPr>
-        <w:pStyle w:val="BodyText"/>
-      </w:pPr>
-      <w:r>
-        <w:t xml:space="preserve">The risk-warning results also temper the interpretation of ADE. Kalman-CV has the best trajectory ADE, but CV has a slightly lower mean absolute CPA error in the current risk slice. The difference is small, and both models produce strong warning precision and recall, but the point is important. Downstream navigation metrics can reorder or nuance model preferences. An operational warning layer may care about false alarms, missed warnings and lead-time stability as much as mean position error. Future AIS prediction papers should therefore include at least one downstream navigation-safety metric when making decision-support claims.</w:t>
-      </w:r>
-    </w:p>
-    <w:p>
-      <w:pPr>
-        <w:pStyle w:val="BodyText"/>
-      </w:pPr>
-      <w:r>
-        <w:t xml:space="preserve">This result also suggests a direction for future model design. Instead of training only to minimise pointwise displacement error, a navigation-specific predictor might include losses or calibration objectives related to encounter geometry, CPA uncertainty or warning-threshold stability. Such a model would need careful validation, but it would align the optimisation target more closely with the decision-support task. The current project provides a baseline against which such extensions can be tested.</w:t>
-      </w:r>
-    </w:p>
-    <w:p>
-      <w:pPr>
-        <w:pStyle w:val="BodyText"/>
-      </w:pPr>
-      <w:r>
-        <w:t xml:space="preserve">The vessel-disjoint evaluation is one of the more important additions relative to a simpler evidence report. Vessel identity can leak behaviour into random splits, especially when multiple windows from the same MMSI appear in train and test sets. Holding out MMSI values does not solve every generalisation issue, but it reduces one obvious source of overoptimism. The current results show that CV degrades substantially more than Kalman-CV under vessel-disjoint testing, while ridge regression becomes competitive with Kalman-CV. This suggests that model robustness depends on both the physical assumption and the split boundary.</w:t>
-      </w:r>
-    </w:p>
-    <w:p>
-      <w:pPr>
-        <w:pStyle w:val="BodyText"/>
-      </w:pPr>
-      <w:r>
-        <w:t xml:space="preserve">The results should not be oversold. The current neural baselines are deliberately modest and documented as baselines. The tuning protocol records a validation-set proxy search, but it does not represent a comprehensive neural architecture search. A future neural study could improve scaling, loss design, coordinate parameterisation, sequence length, map context, vessel type metadata or encounter-aware objectives. Such improvements may well change the neural results. The contribution here is that those future claims should be made against the current kind of evidence chain: auditable data, strong baselines, split definitions, statistical summaries and downstream warning analysis.</w:t>
-      </w:r>
-    </w:p>
-    <w:p>
-      <w:pPr>
-        <w:pStyle w:val="BodyText"/>
-      </w:pPr>
-      <w:r>
-        <w:t xml:space="preserve">For practitioners, the project has a direct use. Running the pipeline on updated historical AIS source dates can regenerate the same tables, figures and warning outputs. The</w:t>
+        <w:t xml:space="preserve">The main result is conservative but practically useful. A simple, transparent motion model remains difficult to beat for short-horizon AIS forecasting, and a Kalman-style version of that model is the strongest reported baseline by ADE under both temporal and vessel-disjoint holdouts. This finding has immediate implications for navigation research. A new AIS prediction model should be compared against well-implemented kinematic baselines, not only against other neural models or weakened classical references. If it fails to improve on those baselines, the paper can still contribute if it explains where the failure occurs and what it reveals about the evaluation protocol.</w:t>
+      </w:r>
+    </w:p>
+    <w:p>
+      <w:pPr>
+        <w:pStyle w:val="BodyText"/>
+      </w:pPr>
+      <w:r>
+        <w:t xml:space="preserve">For navigation research, the value of this result is an explicit evidence standard. The comparison links data provenance, split definitions, trajectory metrics and warning outputs before drawing a practical conclusion. That stance is well suited to safety-related navigation work, where a carefully bounded benchmark can be more useful than a premature performance claim.</w:t>
+      </w:r>
+    </w:p>
+    <w:p>
+      <w:pPr>
+        <w:pStyle w:val="BodyText"/>
+      </w:pPr>
+      <w:r>
+        <w:t xml:space="preserve">The risk-warning results also temper the interpretation of ADE. Kalman-CV has the best trajectory ADE, but CV has a slightly lower mean absolute CPA error in the reported risk slice. The difference is small, and both models produce strong warning precision and recall, but the point is important. Downstream navigation metrics can reorder or nuance model preferences. An operational warning layer may care about false alarms, missed warnings and lead-time stability as much as mean position error. Future AIS prediction papers should therefore include at least one downstream navigation-safety metric when making decision-support claims.</w:t>
+      </w:r>
+    </w:p>
+    <w:p>
+      <w:pPr>
+        <w:pStyle w:val="BodyText"/>
+      </w:pPr>
+      <w:r>
+        <w:t xml:space="preserve">This result also suggests a direction for future model design. Instead of training only to minimise pointwise displacement error, a navigation-specific predictor might include losses or calibration objectives related to encounter geometry, CPA uncertainty or warning-threshold stability. Such a model would need careful validation, but it would align the optimisation target more closely with the decision-support task. The reported benchmark provides a baseline against which such extensions can be tested.</w:t>
+      </w:r>
+    </w:p>
+    <w:p>
+      <w:pPr>
+        <w:pStyle w:val="BodyText"/>
+      </w:pPr>
+      <w:r>
+        <w:t xml:space="preserve">The vessel-disjoint evaluation is one of the more important additions relative to a simpler evidence report. Vessel identity can leak behaviour into random splits, especially when multiple windows from the same MMSI appear in train and test sets. Holding out MMSI values does not solve every generalisation issue, but it reduces one obvious source of overoptimism. The reported results show that CV degrades substantially more than Kalman-CV under vessel-disjoint testing, while ridge regression becomes competitive with Kalman-CV. This suggests that model robustness depends on both the physical assumption and the split boundary.</w:t>
+      </w:r>
+    </w:p>
+    <w:p>
+      <w:pPr>
+        <w:pStyle w:val="BodyText"/>
+      </w:pPr>
+      <w:r>
+        <w:t xml:space="preserve">The neural results should remain claim-bounded. These neural baselines are deliberately modest and documented as baselines. The tuning protocol records a validation-set proxy search, but it does not represent a comprehensive neural architecture search. A future neural study could improve scaling, loss design, coordinate parameterisation, sequence length, map context, vessel type metadata or encounter-aware objectives. Such improvements may well change the neural results. The contribution here is that those future claims should be made against this kind of evidence chain: auditable data, strong baselines, split definitions, statistical summaries and downstream warning analysis.</w:t>
+      </w:r>
+    </w:p>
+    <w:p>
+      <w:pPr>
+        <w:pStyle w:val="BodyText"/>
+      </w:pPr>
+      <w:r>
+        <w:t xml:space="preserve">For practitioners, the workflow has a direct use. Running the pipeline on updated historical AIS source dates can regenerate the same tables, figures and warning outputs. The repository also includes an offline prediction-export utility that produces trajectory predictions and risk-warning records from prepared AIS data. This is not a live operational service, but it demonstrates how the benchmark can be extended into a monitoring workflow, subject to the same limitations about historical data quality, warning thresholds and absence of closed-loop validation.</w:t>
+      </w:r>
+    </w:p>
+    <w:p>
+      <w:pPr>
+        <w:pStyle w:val="BodyText"/>
+      </w:pPr>
+      <w:r>
+        <w:t xml:space="preserve">The practical route from this benchmark to an operational tool would require several additional layers. First, the data ingestion layer would need live AIS handling, latency monitoring and missing-message logic. Second, the prediction layer would need calibrated uncertainty rather than only point trajectories. Third, the warning layer would need human-factor evaluation so that alert frequency, phrasing and timing support rather than distract operators. Fourth, any avoidance recommendation would need explicit COLREGs interpretation and closed-loop testing. The present work does not complete those steps, but it gives them a reproducible starting point.</w:t>
+      </w:r>
+    </w:p>
+    <w:bookmarkEnd w:id="35"/>
+    <w:bookmarkStart w:id="36" w:name="limitations"/>
+    <w:p>
+      <w:pPr>
+        <w:pStyle w:val="Heading2"/>
+      </w:pPr>
+      <w:r>
+        <w:t xml:space="preserve">8. LIMITATIONS</w:t>
+      </w:r>
+    </w:p>
+    <w:p>
+      <w:pPr>
+        <w:pStyle w:val="FirstParagraph"/>
+      </w:pPr>
+      <w:r>
+        <w:t xml:space="preserve">The evidence is historical. It does not ingest a live AIS stream and does not validate real-time deployment. The four source dates provide a stronger protocol than a single-day experiment, but they do not prove all-day, seasonal or global generalisation. The processed artefact includes useful metadata, yet it does not include every contextual variable that could matter, such as vessel class reliability, weather, traffic-control context, chart constraints or planned routes.</w:t>
+      </w:r>
+    </w:p>
+    <w:p>
+      <w:pPr>
+        <w:pStyle w:val="BodyText"/>
+      </w:pPr>
+      <w:r>
+        <w:t xml:space="preserve">The risk-warning task is an AIS-derived decision-support evaluation. It is not a simulator of bridge-team behaviour, not a COLREGs compliance proof and not an autonomous collision-avoidance validation. The International Regulations for Preventing Collisions at Sea remain a legal and operational framework far richer than the thresholded CPA/TCPA labels used here (International Maritime Organization, 1972). Any operational use would require human-factors assessment, false-alarm tolerance analysis, traffic-service integration, reliability engineering and domain-specific validation.</w:t>
+      </w:r>
+    </w:p>
+    <w:bookmarkEnd w:id="36"/>
+    <w:bookmarkStart w:id="37" w:name="conclusions"/>
+    <w:p>
+      <w:pPr>
+        <w:pStyle w:val="Heading2"/>
+      </w:pPr>
+      <w:r>
+        <w:t xml:space="preserve">9. CONCLUSIONS</w:t>
+      </w:r>
+    </w:p>
+    <w:p>
+      <w:pPr>
+        <w:pStyle w:val="FirstParagraph"/>
+      </w:pPr>
+      <w:r>
+        <w:t xml:space="preserve">This paper reports a reproducible AIS trajectory-prediction benchmark for navigation risk-warning support. The evidence chain links raw historical AIS data, checksummed preprocessing, temporal and vessel-disjoint splits, kinematic/statistical/neural baselines, paired statistical summaries, scenario-slice analysis and CPA/TCPA warning metrics. The best mean-ADE model is Kalman-CV on both temporal and vessel-disjoint holdouts. Constant velocity remains a strong short-horizon baseline, and the documented neural sequence baselines do not outperform the simple baselines under this controlled protocol. The practical lesson is not that deep learning has no role in maritime prediction, but that navigation papers need strong baselines, reproducible splits and downstream warning metrics before making decision-support claims.</w:t>
+      </w:r>
+    </w:p>
+    <w:bookmarkEnd w:id="37"/>
+    <w:bookmarkStart w:id="38" w:name="data-and-code-availability"/>
+    <w:p>
+      <w:pPr>
+        <w:pStyle w:val="Heading2"/>
+      </w:pPr>
+      <w:r>
+        <w:t xml:space="preserve">DATA AND CODE AVAILABILITY</w:t>
+      </w:r>
+    </w:p>
+    <w:p>
+      <w:pPr>
+        <w:pStyle w:val="FirstParagraph"/>
+      </w:pPr>
+      <w:r>
+        <w:t xml:space="preserve">The code, configuration files, generated figures, compact evidence artefacts and manuscript-generation workflow are available at https://github.com/TristanLib/ais, archived under tag</w:t>
       </w:r>
       <w:r>
         <w:t xml:space="preserve"> </w:t>
@@ -2898,31 +4238,36 @@
         <w:rPr>
           <w:rStyle w:val="VerbatimChar"/>
         </w:rPr>
-        <w:t xml:space="preserve">predict_latest_ais.py</w:t>
-      </w:r>
-      <w:r>
-        <w:t xml:space="preserve"> </w:t>
-      </w:r>
-      <w:r>
-        <w:t xml:space="preserve">script in the project exports offline trajectory predictions and risk warnings from the latest available prepared data. This is not a live operational service, but it demonstrates how the benchmark can be extended into a monitoring workflow. With new AIS data, the same code can produce current-period predictions and risk-warning candidates, subject to the same limitations about historical data quality, warning thresholds and absence of closed-loop validation.</w:t>
-      </w:r>
-    </w:p>
-    <w:p>
-      <w:pPr>
-        <w:pStyle w:val="BodyText"/>
-      </w:pPr>
-      <w:r>
-        <w:t xml:space="preserve">The practical route from this benchmark to an operational tool would require several additional layers. First, the data ingestion layer would need live AIS handling, latency monitoring and missing-message logic. Second, the prediction layer would need calibrated uncertainty rather than only point trajectories. Third, the warning layer would need human-factor evaluation so that alert frequency, phrasing and timing support rather than distract operators. Fourth, any avoidance recommendation would need explicit COLREGs interpretation and closed-loop testing. The present work does not complete those steps, but it gives them a reproducible starting point.</w:t>
-      </w:r>
-    </w:p>
-    <w:bookmarkEnd w:id="34"/>
-    <w:bookmarkStart w:id="35" w:name="limitations"/>
+        <w:t xml:space="preserve">jon-submission-v1.3</w:t>
+      </w:r>
+      <w:r>
+        <w:t xml:space="preserve">. No separate archival DOI is available for this release at the time of submission. The source data are derived from public NOAA MarineCadastre.gov historical AIS files subject to NOAA data access terms; the repository does not redistribute raw NOAA AIS files or processed NumPy arrays.</w:t>
+      </w:r>
+    </w:p>
+    <w:p>
+      <w:pPr>
+        <w:pStyle w:val="BodyText"/>
+      </w:pPr>
+      <w:r>
+        <w:t xml:space="preserve">The full reproduction command and evidence-file inventory are provided in Supplementary File S1 and in the repository README.</w:t>
+      </w:r>
+    </w:p>
+    <w:p>
+      <w:pPr>
+        <w:pStyle w:val="BodyText"/>
+      </w:pPr>
+      <w:r>
+        <w:t xml:space="preserve">The supplementary package accompanying this manuscript includes manifest summaries, full model metrics, horizon and group summaries, statistical summaries, neural tuning records and risk-warning metrics, but excludes the large per-sample error file to satisfy supplementary file-size guidance.</w:t>
+      </w:r>
+    </w:p>
+    <w:bookmarkEnd w:id="38"/>
+    <w:bookmarkStart w:id="39" w:name="competing-interests"/>
     <w:p>
       <w:pPr>
         <w:pStyle w:val="Heading2"/>
       </w:pPr>
       <w:r>
-        <w:t xml:space="preserve">8. Limitations</w:t>
+        <w:t xml:space="preserve">COMPETING INTERESTS</w:t>
       </w:r>
     </w:p>
     <w:p>
@@ -2930,33 +4275,17 @@
         <w:pStyle w:val="FirstParagraph"/>
       </w:pPr>
       <w:r>
-        <w:t xml:space="preserve">The current evidence is historical. It does not ingest a live AIS stream and does not validate real-time deployment. The four source dates provide a stronger protocol than a single-day experiment, but they do not prove all-day, seasonal or global generalisation. The processed artifact includes useful metadata, yet it does not include every contextual variable that could matter, such as vessel class reliability, weather, traffic-control context, chart constraints or planned routes.</w:t>
-      </w:r>
-    </w:p>
-    <w:p>
-      <w:pPr>
-        <w:pStyle w:val="BodyText"/>
-      </w:pPr>
-      <w:r>
-        <w:t xml:space="preserve">The risk-warning task is an AIS-derived decision-support evaluation. It is not a simulator of bridge-team behaviour, not a COLREGs compliance proof and not an autonomous collision-avoidance validation. The International Regulations for Preventing Collisions at Sea remain a legal and operational framework far richer than the thresholded CPA/TCPA labels used here (International Maritime Organization, 1972). Any operational use would require human-factors assessment, false-alarm tolerance analysis, traffic-service integration, reliability engineering and domain-specific validation.</w:t>
-      </w:r>
-    </w:p>
-    <w:p>
-      <w:pPr>
-        <w:pStyle w:val="BodyText"/>
-      </w:pPr>
-      <w:r>
-        <w:t xml:space="preserve">The current manuscript also contains publication-preparation placeholders. Author names, affiliations, funding, ORCID identifiers, acknowledgements and suggested reviewers must be completed by the authors before ScholarOne upload. The reference list is formatted in Harvard/JON style as a candidate list, but it should receive a final bibliographic audit before submission.</w:t>
-      </w:r>
-    </w:p>
-    <w:bookmarkEnd w:id="35"/>
-    <w:bookmarkStart w:id="36" w:name="conclusions"/>
+        <w:t xml:space="preserve">The author declares no competing interests.</w:t>
+      </w:r>
+    </w:p>
+    <w:bookmarkEnd w:id="39"/>
+    <w:bookmarkStart w:id="40" w:name="author-contributions"/>
     <w:p>
       <w:pPr>
         <w:pStyle w:val="Heading2"/>
       </w:pPr>
       <w:r>
-        <w:t xml:space="preserve">9. Conclusions</w:t>
+        <w:t xml:space="preserve">AUTHOR CONTRIBUTIONS</w:t>
       </w:r>
     </w:p>
     <w:p>
@@ -2964,17 +4293,17 @@
         <w:pStyle w:val="FirstParagraph"/>
       </w:pPr>
       <w:r>
-        <w:t xml:space="preserve">This paper presents a reproducible AIS trajectory-prediction benchmark for navigation risk-warning support. The current evidence chain links raw historical AIS data, checksummed preprocessing, temporal and vessel-disjoint splits, kinematic/statistical/neural baselines, paired statistical summaries, scenario-slice analysis and CPA/TCPA warning metrics. The best current ADE model is Kalman-CV on both temporal and vessel-disjoint holdouts. Constant velocity remains a strong short-horizon baseline, and naive neural baselines fail to outperform the simple baselines under this controlled protocol. The practical lesson is not that deep learning has no role in maritime prediction, but that navigation papers need strong baselines, reproducible splits and downstream warning metrics before making decision-support claims.</w:t>
-      </w:r>
-    </w:p>
-    <w:bookmarkEnd w:id="36"/>
-    <w:bookmarkStart w:id="37" w:name="data-and-code-availability"/>
+        <w:t xml:space="preserve">Li Bo is the sole author and was responsible for study conception, methodology, software workflow, validation, formal analysis, interpretation, manuscript drafting and final approval.</w:t>
+      </w:r>
+    </w:p>
+    <w:bookmarkEnd w:id="40"/>
+    <w:bookmarkStart w:id="41" w:name="funding"/>
     <w:p>
       <w:pPr>
         <w:pStyle w:val="Heading2"/>
       </w:pPr>
       <w:r>
-        <w:t xml:space="preserve">Data and Code Availability</w:t>
+        <w:t xml:space="preserve">FUNDING</w:t>
       </w:r>
     </w:p>
     <w:p>
@@ -2982,54 +4311,17 @@
         <w:pStyle w:val="FirstParagraph"/>
       </w:pPr>
       <w:r>
-        <w:t xml:space="preserve">The manuscript was generated from repository artifacts in the local project</w:t>
-      </w:r>
-      <w:r>
-        <w:t xml:space="preserve"> </w:t>
-      </w:r>
-      <w:r>
-        <w:rPr>
-          <w:rStyle w:val="VerbatimChar"/>
-        </w:rPr>
-        <w:t xml:space="preserve">ship-prediction-avoidance</w:t>
-      </w:r>
-      <w:r>
-        <w:t xml:space="preserve">. The source data are derived from NOAA MarineCadastre.gov AIS files subject to NOAA data access terms. The reproducibility command for the high-quality evidence package is:</w:t>
-      </w:r>
-    </w:p>
-    <w:p>
-      <w:pPr>
-        <w:pStyle w:val="SourceCode"/>
-      </w:pPr>
-      <w:r>
-        <w:rPr>
-          <w:rStyle w:val="VariableTok"/>
-        </w:rPr>
-        <w:t xml:space="preserve">PYTHON_BIN</w:t>
-      </w:r>
-      <w:r>
-        <w:rPr>
-          <w:rStyle w:val="OperatorTok"/>
-        </w:rPr>
-        <w:t xml:space="preserve">=</w:t>
-      </w:r>
-      <w:r>
-        <w:rPr>
-          <w:rStyle w:val="NormalTok"/>
-        </w:rPr>
-        <w:t xml:space="preserve">.venv/bin/python </w:t>
-      </w:r>
-      <w:r>
-        <w:rPr>
-          <w:rStyle w:val="FunctionTok"/>
-        </w:rPr>
-        <w:t xml:space="preserve">bash</w:t>
-      </w:r>
-      <w:r>
-        <w:rPr>
-          <w:rStyle w:val="NormalTok"/>
-        </w:rPr>
-        <w:t xml:space="preserve"> scripts/run_high_quality_pipeline.sh</w:t>
+        <w:t xml:space="preserve">This research received no specific grant from any funding agency, commercial or not-for-profit sectors.</w:t>
+      </w:r>
+    </w:p>
+    <w:bookmarkEnd w:id="41"/>
+    <w:bookmarkStart w:id="42" w:name="ai-use-declaration"/>
+    <w:p>
+      <w:pPr>
+        <w:pStyle w:val="Heading2"/>
+      </w:pPr>
+      <w:r>
+        <w:t xml:space="preserve">AI-USE DECLARATION</w:t>
       </w:r>
     </w:p>
     <w:p>
@@ -3037,17 +4329,17 @@
         <w:pStyle w:val="FirstParagraph"/>
       </w:pPr>
       <w:r>
-        <w:t xml:space="preserve">The final public repository URL or archival DOI should be inserted before submission if the authors decide to release the code and generated artifacts publicly. The supplementary package accompanying this manuscript includes manifest summaries, full model metrics, horizon and group summaries, statistical summaries, neural tuning records and risk-warning metrics, but excludes the large per-sample error file to satisfy the current supplementary-file size constraint.</w:t>
-      </w:r>
-    </w:p>
-    <w:bookmarkEnd w:id="37"/>
-    <w:bookmarkStart w:id="38" w:name="competing-interests"/>
+        <w:t xml:space="preserve">Generative AI tools were used in May 2026 for assistance with code drafting, language editing, manuscript structuring and consistency checks against repository evidence files. The author verified all numerical results and is responsible for the final content.</w:t>
+      </w:r>
+    </w:p>
+    <w:bookmarkEnd w:id="42"/>
+    <w:bookmarkStart w:id="43" w:name="acknowledgements"/>
     <w:p>
       <w:pPr>
         <w:pStyle w:val="Heading2"/>
       </w:pPr>
       <w:r>
-        <w:t xml:space="preserve">Competing Interests</w:t>
+        <w:t xml:space="preserve">ACKNOWLEDGEMENTS</w:t>
       </w:r>
     </w:p>
     <w:p>
@@ -3055,17 +4347,17 @@
         <w:pStyle w:val="FirstParagraph"/>
       </w:pPr>
       <w:r>
-        <w:t xml:space="preserve">The authors declare no competing interests. This statement should be reviewed and replaced if any author has a relevant financial, professional or personal relationship to disclose.</w:t>
-      </w:r>
-    </w:p>
-    <w:bookmarkEnd w:id="38"/>
-    <w:bookmarkStart w:id="39" w:name="author-contributions"/>
+        <w:t xml:space="preserve">The author thanks his family for their patience, encouragement and support during the preparation of this work.</w:t>
+      </w:r>
+    </w:p>
+    <w:bookmarkEnd w:id="43"/>
+    <w:bookmarkStart w:id="44" w:name="supplementary-material"/>
     <w:p>
       <w:pPr>
         <w:pStyle w:val="Heading2"/>
       </w:pPr>
       <w:r>
-        <w:t xml:space="preserve">Author Contributions</w:t>
+        <w:t xml:space="preserve">SUPPLEMENTARY MATERIAL</w:t>
       </w:r>
     </w:p>
     <w:p>
@@ -3073,17 +4365,17 @@
         <w:pStyle w:val="FirstParagraph"/>
       </w:pPr>
       <w:r>
-        <w:t xml:space="preserve">[Author 1] conceived the study and led manuscript preparation. [Author 2] implemented the AIS preprocessing and benchmark pipeline. [Author 3] reviewed navigation-risk framing and interpretation. These placeholders must be replaced with the actual contributor roles before submission.</w:t>
-      </w:r>
-    </w:p>
-    <w:bookmarkEnd w:id="39"/>
-    <w:bookmarkStart w:id="40" w:name="funding"/>
+        <w:t xml:space="preserve">Supplementary File S1 contains the reproducibility manifest, full benchmark tables, neural baseline configuration summary, scenario summaries and risk-warning evidence used to generate this manuscript. The individual supplementary archive is kept below the 10 MB per-file guideline.</w:t>
+      </w:r>
+    </w:p>
+    <w:bookmarkEnd w:id="44"/>
+    <w:bookmarkStart w:id="45" w:name="references"/>
     <w:p>
       <w:pPr>
         <w:pStyle w:val="Heading2"/>
       </w:pPr>
       <w:r>
-        <w:t xml:space="preserve">Funding</w:t>
+        <w:t xml:space="preserve">REFERENCES</w:t>
       </w:r>
     </w:p>
     <w:p>
@@ -3091,79 +4383,7 @@
         <w:pStyle w:val="FirstParagraph"/>
       </w:pPr>
       <w:r>
-        <w:t xml:space="preserve">[Funding information to be completed before submission. If no external funding supported the work, state: This research received no specific grant from any funding agency, commercial or not-for-profit sectors.]</w:t>
-      </w:r>
-    </w:p>
-    <w:bookmarkEnd w:id="40"/>
-    <w:bookmarkStart w:id="41" w:name="ai-use-declaration"/>
-    <w:p>
-      <w:pPr>
-        <w:pStyle w:val="Heading2"/>
-      </w:pPr>
-      <w:r>
-        <w:t xml:space="preserve">AI-Use Declaration</w:t>
-      </w:r>
-    </w:p>
-    <w:p>
-      <w:pPr>
-        <w:pStyle w:val="FirstParagraph"/>
-      </w:pPr>
-      <w:r>
-        <w:t xml:space="preserve">OpenAI Codex/ChatGPT was used in May 2026 to assist with code generation, manuscript drafting, document structuring and consistency checks against repository artifacts. The authors are responsible for all content, verified the numerical claims against generated evidence files, and will complete a final reference and language audit before submission.</w:t>
-      </w:r>
-    </w:p>
-    <w:bookmarkEnd w:id="41"/>
-    <w:bookmarkStart w:id="42" w:name="acknowledgements"/>
-    <w:p>
-      <w:pPr>
-        <w:pStyle w:val="Heading2"/>
-      </w:pPr>
-      <w:r>
-        <w:t xml:space="preserve">Acknowledgements</w:t>
-      </w:r>
-    </w:p>
-    <w:p>
-      <w:pPr>
-        <w:pStyle w:val="FirstParagraph"/>
-      </w:pPr>
-      <w:r>
-        <w:t xml:space="preserve">[Acknowledgements to individuals or organisations, if any, should be inserted here. The target journal should not be thanked in this section.]</w:t>
-      </w:r>
-    </w:p>
-    <w:bookmarkEnd w:id="42"/>
-    <w:bookmarkStart w:id="43" w:name="supplementary-material"/>
-    <w:p>
-      <w:pPr>
-        <w:pStyle w:val="Heading2"/>
-      </w:pPr>
-      <w:r>
-        <w:t xml:space="preserve">Supplementary Material</w:t>
-      </w:r>
-    </w:p>
-    <w:p>
-      <w:pPr>
-        <w:pStyle w:val="FirstParagraph"/>
-      </w:pPr>
-      <w:r>
-        <w:t xml:space="preserve">Supplementary File S1 contains the reproducibility manifest, full benchmark tables, scenario summaries and risk-warning evidence used to generate this manuscript. The individual supplementary archive produced by the project is kept below the current 10 MB per-file guideline.</w:t>
-      </w:r>
-    </w:p>
-    <w:bookmarkEnd w:id="43"/>
-    <w:bookmarkStart w:id="44" w:name="references"/>
-    <w:p>
-      <w:pPr>
-        <w:pStyle w:val="Heading2"/>
-      </w:pPr>
-      <w:r>
-        <w:t xml:space="preserve">References</w:t>
-      </w:r>
-    </w:p>
-    <w:p>
-      <w:pPr>
-        <w:pStyle w:val="FirstParagraph"/>
-      </w:pPr>
-      <w:r>
-        <w:t xml:space="preserve">Bai, S., Kolter, J. Z. and Koltun, V. (2018). An Empirical Evaluation of Generic Convolutional and Recurrent Networks for Sequence Modeling. arXiv:1803.01271.</w:t>
+        <w:t xml:space="preserve">Bai, S., Kolter, J. Z. and Koltun, V. (2018). An Empirical Evaluation of Generic Convolutional and Recurrent Networks for Sequence Modeling. arXiv:1803.01271. https://arxiv.org/abs/1803.01271.</w:t>
       </w:r>
     </w:p>
     <w:p>
@@ -3179,15 +4399,15 @@
         <w:pStyle w:val="BodyText"/>
       </w:pPr>
       <w:r>
-        <w:t xml:space="preserve">Cho, K., van Merrienboer, B., Gulcehre, C., Bahdanau, D., Bougares, F., Schwenk, H. and Bengio, Y. (2014). Learning Phrase Representations using RNN Encoder-Decoder for Statistical Machine Translation. Proceedings of the 2014 Conference on Empirical Methods in Natural Language Processing, 1724-1734.</w:t>
-      </w:r>
-    </w:p>
-    <w:p>
-      <w:pPr>
-        <w:pStyle w:val="BodyText"/>
-      </w:pPr>
-      <w:r>
-        <w:t xml:space="preserve">Dalsnes, B. R., Hexeberg, S., Flaten, A. L., Eriksen, B. O. H. and Brekke, E. F. (2018). The Neighbour Course Distribution Method with Gaussian Mixture Models for AIS-Based Vessel Trajectory Prediction. Proceedings of the 21st International Conference on Information Fusion.</w:t>
+        <w:t xml:space="preserve">Cho, K., van Merrienboer, B., Gulcehre, C., Bahdanau, D., Bougares, F., Schwenk, H. and Bengio, Y. (2014). Learning Phrase Representations using RNN Encoder-Decoder for Statistical Machine Translation. Proceedings of the 2014 Conference on Empirical Methods in Natural Language Processing, 1724-1734. doi:10.3115/v1/D14-1179.</w:t>
+      </w:r>
+    </w:p>
+    <w:p>
+      <w:pPr>
+        <w:pStyle w:val="BodyText"/>
+      </w:pPr>
+      <w:r>
+        <w:t xml:space="preserve">Dalsnes, B. R., Hexeberg, S., Flaten, A. L., Eriksen, B. O. H. and Brekke, E. F. (2018). The Neighbor Course Distribution Method with Gaussian Mixture Models for AIS-Based Vessel Trajectory Prediction. Proceedings of the 21st International Conference on Information Fusion. doi:10.23919/ICIF.2018.8455607.</w:t>
       </w:r>
     </w:p>
     <w:p>
@@ -3203,47 +4423,47 @@
         <w:pStyle w:val="BodyText"/>
       </w:pPr>
       <w:r>
-        <w:t xml:space="preserve">Endsley, M. R. (1995). Toward a Theory of Situation Awareness in Dynamic Systems. Human Factors, 37, 32-64.</w:t>
-      </w:r>
-    </w:p>
-    <w:p>
-      <w:pPr>
-        <w:pStyle w:val="BodyText"/>
-      </w:pPr>
-      <w:r>
-        <w:t xml:space="preserve">Fujii, Y. and Tanaka, K. (1971). Traffic Capacity. The Journal of Navigation, 24, 543-552.</w:t>
-      </w:r>
-    </w:p>
-    <w:p>
-      <w:pPr>
-        <w:pStyle w:val="BodyText"/>
-      </w:pPr>
-      <w:r>
-        <w:t xml:space="preserve">Goodwin, E. M. (1975). A Statistical Study of Ship Domains. The Journal of Navigation, 28, 328-344.</w:t>
-      </w:r>
-    </w:p>
-    <w:p>
-      <w:pPr>
-        <w:pStyle w:val="BodyText"/>
-      </w:pPr>
-      <w:r>
-        <w:t xml:space="preserve">Hansen, M. G., Jensen, T. K., Lehn-Schioler, T., Melchild, K., Rasmussen, F. M. and Ennemark, F. (2013). Empirical Ship Domain based on AIS Data. The Journal of Navigation, 66, 931-940.</w:t>
-      </w:r>
-    </w:p>
-    <w:p>
-      <w:pPr>
-        <w:pStyle w:val="BodyText"/>
-      </w:pPr>
-      <w:r>
-        <w:t xml:space="preserve">Hexeberg, S., Flaten, A. L., Eriksen, B. O. H. and Brekke, E. F. (2017). AIS-Based Vessel Trajectory Prediction. Proceedings of the 20th International Conference on Information Fusion.</w:t>
-      </w:r>
-    </w:p>
-    <w:p>
-      <w:pPr>
-        <w:pStyle w:val="BodyText"/>
-      </w:pPr>
-      <w:r>
-        <w:t xml:space="preserve">Hochreiter, S. and Schmidhuber, J. (1997). Long Short-Term Memory. Neural Computation, 9, 1735-1780.</w:t>
+        <w:t xml:space="preserve">Endsley, M. R. (1995). Toward a Theory of Situation Awareness in Dynamic Systems. Human Factors, 37, 32-64. doi:10.1518/001872095779049543.</w:t>
+      </w:r>
+    </w:p>
+    <w:p>
+      <w:pPr>
+        <w:pStyle w:val="BodyText"/>
+      </w:pPr>
+      <w:r>
+        <w:t xml:space="preserve">Fujii, Y. and Tanaka, K. (1971). Traffic Capacity. The Journal of Navigation, 24, 543-552. doi:10.1017/S0373463300022384.</w:t>
+      </w:r>
+    </w:p>
+    <w:p>
+      <w:pPr>
+        <w:pStyle w:val="BodyText"/>
+      </w:pPr>
+      <w:r>
+        <w:t xml:space="preserve">Goodwin, E. M. (1975). A Statistical Study of Ship Domains. The Journal of Navigation, 28, 328-344. doi:10.1017/S0373463300041230.</w:t>
+      </w:r>
+    </w:p>
+    <w:p>
+      <w:pPr>
+        <w:pStyle w:val="BodyText"/>
+      </w:pPr>
+      <w:r>
+        <w:t xml:space="preserve">Hansen, M. G., Jensen, T. K., Lehn-Schioler, T., Melchild, K., Rasmussen, F. M. and Ennemark, F. (2013). Empirical Ship Domain based on AIS Data. The Journal of Navigation, 66, 931-940. doi:10.1017/S0373463313000489.</w:t>
+      </w:r>
+    </w:p>
+    <w:p>
+      <w:pPr>
+        <w:pStyle w:val="BodyText"/>
+      </w:pPr>
+      <w:r>
+        <w:t xml:space="preserve">Hexeberg, S., Flaten, A. L., Eriksen, B. O. H. and Brekke, E. F. (2017). AIS-Based Vessel Trajectory Prediction. Proceedings of the 20th International Conference on Information Fusion. doi:10.23919/ICIF.2017.8009762.</w:t>
+      </w:r>
+    </w:p>
+    <w:p>
+      <w:pPr>
+        <w:pStyle w:val="BodyText"/>
+      </w:pPr>
+      <w:r>
+        <w:t xml:space="preserve">Hochreiter, S. and Schmidhuber, J. (1997). Long Short-Term Memory. Neural Computation, 9, 1735-1780. doi:10.1162/neco.1997.9.8.1735.</w:t>
       </w:r>
     </w:p>
     <w:p>
@@ -3259,23 +4479,23 @@
         <w:pStyle w:val="BodyText"/>
       </w:pPr>
       <w:r>
-        <w:t xml:space="preserve">Kalman, R. E. (1960). A New Approach to Linear Filtering and Prediction Problems. Journal of Basic Engineering, 82, 35-45.</w:t>
-      </w:r>
-    </w:p>
-    <w:p>
-      <w:pPr>
-        <w:pStyle w:val="BodyText"/>
-      </w:pPr>
-      <w:r>
-        <w:t xml:space="preserve">Kingma, D. P. and Ba, J. (2015). Adam: A Method for Stochastic Optimization. Proceedings of the International Conference on Learning Representations.</w:t>
-      </w:r>
-    </w:p>
-    <w:p>
-      <w:pPr>
-        <w:pStyle w:val="BodyText"/>
-      </w:pPr>
-      <w:r>
-        <w:t xml:space="preserve">Leek, J. T. and Peng, R. D. (2015). Reproducible Research Can Still Be Wrong: Adopting a Prevention Approach. Proceedings of the National Academy of Sciences, 112, 1645-1646.</w:t>
+        <w:t xml:space="preserve">Kalman, R. E. (1960). A New Approach to Linear Filtering and Prediction Problems. Journal of Basic Engineering, 82, 35-45. doi:10.1115/1.3662552.</w:t>
+      </w:r>
+    </w:p>
+    <w:p>
+      <w:pPr>
+        <w:pStyle w:val="BodyText"/>
+      </w:pPr>
+      <w:r>
+        <w:t xml:space="preserve">Kingma, D. P. and Ba, J. (2015). Adam: A Method for Stochastic Optimization. Proceedings of the International Conference on Learning Representations. https://arxiv.org/abs/1412.6980.</w:t>
+      </w:r>
+    </w:p>
+    <w:p>
+      <w:pPr>
+        <w:pStyle w:val="BodyText"/>
+      </w:pPr>
+      <w:r>
+        <w:t xml:space="preserve">Leek, J. T. and Peng, R. D. (2015). Reproducible Research Can Still Be Wrong: Adopting a Prevention Approach. Proceedings of the National Academy of Sciences, 112, 1645-1646. doi:10.1073/pnas.1421412111.</w:t>
       </w:r>
     </w:p>
     <w:p>
@@ -3291,15 +4511,15 @@
         <w:pStyle w:val="BodyText"/>
       </w:pPr>
       <w:r>
-        <w:t xml:space="preserve">Millefiori, L. M., Braca, P., Bryan, K. and Willett, P. (2016). Modeling Vessel Kinematics using a Stochastic Mean-Reverting Process for Long-Term Prediction. IEEE Transactions on Aerospace and Electronic Systems, 52, 2313-2330.</w:t>
-      </w:r>
-    </w:p>
-    <w:p>
-      <w:pPr>
-        <w:pStyle w:val="BodyText"/>
-      </w:pPr>
-      <w:r>
-        <w:t xml:space="preserve">Mou, J. M., van der Tak, C. and Ligteringen, H. (2010). Study on Collision Avoidance in Busy Waterways by using AIS Data. Ocean Engineering, 37, 483-490.</w:t>
+        <w:t xml:space="preserve">Millefiori, L. M., Braca, P., Bryan, K. and Willett, P. (2016). Modeling Vessel Kinematics using a Stochastic Mean-Reverting Process for Long-Term Prediction. IEEE Transactions on Aerospace and Electronic Systems, 52, 2313-2330. doi:10.1109/TAES.2016.150596.</w:t>
+      </w:r>
+    </w:p>
+    <w:p>
+      <w:pPr>
+        <w:pStyle w:val="BodyText"/>
+      </w:pPr>
+      <w:r>
+        <w:t xml:space="preserve">Mou, J. M., van der Tak, C. and Ligteringen, H. (2010). Study on Collision Avoidance in Busy Waterways by using AIS Data. Ocean Engineering, 37, 483-490. doi:10.1016/j.oceaneng.2010.01.012.</w:t>
       </w:r>
     </w:p>
     <w:p>
@@ -3315,7 +4535,7 @@
         <w:pStyle w:val="BodyText"/>
       </w:pPr>
       <w:r>
-        <w:t xml:space="preserve">Pallotta, G., Vespe, M. and Bryan, K. (2013). Vessel Pattern Knowledge Discovery from AIS Data: A Framework for Anomaly Detection and Route Prediction. Entropy, 15, 2218-2245.</w:t>
+        <w:t xml:space="preserve">Pallotta, G., Vespe, M. and Bryan, K. (2013). Vessel Pattern Knowledge Discovery from AIS Data: A Framework for Anomaly Detection and Route Prediction. Entropy, 15, 2218-2245. doi:10.3390/e15062218.</w:t>
       </w:r>
     </w:p>
     <w:p>
@@ -3331,75 +4551,75 @@
         <w:pStyle w:val="BodyText"/>
       </w:pPr>
       <w:r>
-        <w:t xml:space="preserve">Pedregosa, F., Varoquaux, G., Gramfort, A., Michel, V., Thirion, B., Grisel, O., Blondel, M., Prettenhofer, P., Weiss, R., Dubourg, V. and others. (2011). Scikit-learn: Machine Learning in Python. Journal of Machine Learning Research, 12, 2825-2830.</w:t>
-      </w:r>
-    </w:p>
-    <w:p>
-      <w:pPr>
-        <w:pStyle w:val="BodyText"/>
-      </w:pPr>
-      <w:r>
-        <w:t xml:space="preserve">Pineau, J., Vincent-Lamarre, P., Sinha, K., Lariviere, V., Beygelzimer, A., d’Alche-Buc, F., Fox, E. and Larochelle, H. (2021). Improving Reproducibility in Machine Learning Research. Journal of Machine Learning Research, 22, 1-20.</w:t>
-      </w:r>
-    </w:p>
-    <w:p>
-      <w:pPr>
-        <w:pStyle w:val="BodyText"/>
-      </w:pPr>
-      <w:r>
-        <w:t xml:space="preserve">Ristic, B., La Scala, B., Morelande, M. and Gordon, N. (2008). Statistical Analysis of Motion Patterns in AIS Data: Anomaly Detection and Motion Prediction. Proceedings of the 11th International Conference on Information Fusion.</w:t>
-      </w:r>
-    </w:p>
-    <w:p>
-      <w:pPr>
-        <w:pStyle w:val="BodyText"/>
-      </w:pPr>
-      <w:r>
-        <w:t xml:space="preserve">Sculley, D., Holt, G., Golovin, D., Davydov, E., Phillips, T., Ebner, D., Chaudhary, V., Young, M., Crespo, J. F. and Dennison, D. (2015). Hidden Technical Debt in Machine Learning Systems. Advances in Neural Information Processing Systems, 28.</w:t>
-      </w:r>
-    </w:p>
-    <w:p>
-      <w:pPr>
-        <w:pStyle w:val="BodyText"/>
-      </w:pPr>
-      <w:r>
-        <w:t xml:space="preserve">Statheros, T., Howells, G. and Maier, K. M. (2008). Autonomous Ship Collision Avoidance Navigation Concepts, Technologies and Techniques. The Journal of Navigation, 61, 129-142.</w:t>
-      </w:r>
-    </w:p>
-    <w:p>
-      <w:pPr>
-        <w:pStyle w:val="BodyText"/>
-      </w:pPr>
-      <w:r>
-        <w:t xml:space="preserve">Szlapczynski, R. and Szlapczynska, J. (2017). Review of Ship Safety Domains: Models and Applications. Ocean Engineering, 145, 277-289.</w:t>
-      </w:r>
-    </w:p>
-    <w:p>
-      <w:pPr>
-        <w:pStyle w:val="BodyText"/>
-      </w:pPr>
-      <w:r>
-        <w:t xml:space="preserve">Tu, E., Zhang, G., Rachmawati, L., Rajabally, E. and Huang, G. B. (2018). Exploiting AIS Data for Intelligent Maritime Navigation: A Comprehensive Survey from Data to Methodology. IEEE Transactions on Intelligent Transportation Systems, 19, 1559-1582.</w:t>
-      </w:r>
-    </w:p>
-    <w:p>
-      <w:pPr>
-        <w:pStyle w:val="BodyText"/>
-      </w:pPr>
-      <w:r>
-        <w:t xml:space="preserve">Vaswani, A., Shazeer, N., Parmar, N., Uszkoreit, J., Jones, L., Gomez, A. N., Kaiser, L. and Polosukhin, I. (2017). Attention Is All You Need. Advances in Neural Information Processing Systems, 30.</w:t>
-      </w:r>
-    </w:p>
-    <w:p>
-      <w:pPr>
-        <w:pStyle w:val="BodyText"/>
-      </w:pPr>
-      <w:r>
-        <w:t xml:space="preserve">Wilson, G., Bryan, J., Cranston, K., Kitzes, J., Nederbragt, L. and Teal, T. K. (2017). Good Enough Practices in Scientific Computing. PLOS Computational Biology, 13, e1005510.</w:t>
-      </w:r>
-    </w:p>
-    <w:bookmarkEnd w:id="44"/>
+        <w:t xml:space="preserve">Pedregosa, F., Varoquaux, G., Gramfort, A., Michel, V., Thirion, B., Grisel, O., Blondel, M., Prettenhofer, P., Weiss, R., Dubourg, V. and others. (2011). Scikit-learn: Machine Learning in Python. Journal of Machine Learning Research, 12, 2825-2830. https://www.jmlr.org/papers/v12/pedregosa11a.html.</w:t>
+      </w:r>
+    </w:p>
+    <w:p>
+      <w:pPr>
+        <w:pStyle w:val="BodyText"/>
+      </w:pPr>
+      <w:r>
+        <w:t xml:space="preserve">Pineau, J., Vincent-Lamarre, P., Sinha, K., Lariviere, V., Beygelzimer, A., d’Alche-Buc, F., Fox, E. and Larochelle, H. (2021). Improving Reproducibility in Machine Learning Research. Journal of Machine Learning Research, 22, 1-20. https://www.jmlr.org/papers/v22/20-303.html.</w:t>
+      </w:r>
+    </w:p>
+    <w:p>
+      <w:pPr>
+        <w:pStyle w:val="BodyText"/>
+      </w:pPr>
+      <w:r>
+        <w:t xml:space="preserve">Ristic, B., La Scala, B., Morelande, M. and Gordon, N. (2008). Statistical Analysis of Motion Patterns in AIS Data: Anomaly Detection and Motion Prediction. Proceedings of the 11th International Conference on Information Fusion. doi:10.1109/ICIF.2008.4632190.</w:t>
+      </w:r>
+    </w:p>
+    <w:p>
+      <w:pPr>
+        <w:pStyle w:val="BodyText"/>
+      </w:pPr>
+      <w:r>
+        <w:t xml:space="preserve">Sculley, D., Holt, G., Golovin, D., Davydov, E., Phillips, T., Ebner, D., Chaudhary, V., Young, M., Crespo, J. F. and Dennison, D. (2015). Hidden Technical Debt in Machine Learning Systems. Advances in Neural Information Processing Systems, 28, 2503-2511.</w:t>
+      </w:r>
+    </w:p>
+    <w:p>
+      <w:pPr>
+        <w:pStyle w:val="BodyText"/>
+      </w:pPr>
+      <w:r>
+        <w:t xml:space="preserve">Statheros, T., Howells, G. and Maier, K. M. (2008). Autonomous Ship Collision Avoidance Navigation Concepts, Technologies and Techniques. The Journal of Navigation, 61, 129-142. doi:10.1017/S037346330700447X.</w:t>
+      </w:r>
+    </w:p>
+    <w:p>
+      <w:pPr>
+        <w:pStyle w:val="BodyText"/>
+      </w:pPr>
+      <w:r>
+        <w:t xml:space="preserve">Szlapczynski, R. and Szlapczynska, J. (2017). Review of Ship Safety Domains: Models and Applications. Ocean Engineering, 145, 277-289. doi:10.1016/j.oceaneng.2017.09.020.</w:t>
+      </w:r>
+    </w:p>
+    <w:p>
+      <w:pPr>
+        <w:pStyle w:val="BodyText"/>
+      </w:pPr>
+      <w:r>
+        <w:t xml:space="preserve">Tu, E., Zhang, G., Rachmawati, L., Rajabally, E. and Huang, G. B. (2018). Exploiting AIS Data for Intelligent Maritime Navigation: A Comprehensive Survey From Data to Methodology. IEEE Transactions on Intelligent Transportation Systems, 19, 1559-1582. doi:10.1109/TITS.2017.2724551.</w:t>
+      </w:r>
+    </w:p>
+    <w:p>
+      <w:pPr>
+        <w:pStyle w:val="BodyText"/>
+      </w:pPr>
+      <w:r>
+        <w:t xml:space="preserve">Vaswani, A., Shazeer, N., Parmar, N., Uszkoreit, J., Jones, L., Gomez, A. N., Kaiser, L. and Polosukhin, I. (2017). Attention Is All You Need. Advances in Neural Information Processing Systems, 30, 5998-6008. https://arxiv.org/abs/1706.03762.</w:t>
+      </w:r>
+    </w:p>
+    <w:p>
+      <w:pPr>
+        <w:pStyle w:val="BodyText"/>
+      </w:pPr>
+      <w:r>
+        <w:t xml:space="preserve">Wilson, G., Bryan, J., Cranston, K., Kitzes, J., Nederbragt, L. and Teal, T. K. (2017). Good Enough Practices in Scientific Computing. PLOS Computational Biology, 13, e1005510. doi:10.1371/journal.pcbi.1005510.</w:t>
+      </w:r>
+    </w:p>
     <w:bookmarkEnd w:id="45"/>
+    <w:bookmarkEnd w:id="46"/>
     <w:sectPr>
       <w:footnotePr>
         <w:numRestart w:val="eachSect"/>

</xml_diff>